<commit_message>
Updated pipeline once again to implement remaining indicators. Updated frontend to display points for dates where real data exists
</commit_message>
<xml_diff>
--- a/docs/architecture/FOCUSED_PIPELINE_ARCHITECTURE.docx
+++ b/docs/architecture/FOCUSED_PIPELINE_ARCHITECTURE.docx
@@ -766,6 +766,468 @@
                 <w:sz w:val="18"/>
                 <w:szCs w:val="18"/>
               </w:rPr>
+              <w:t xml:space="preserve">ACTIVE</w:t>
+            </w:r>
+          </w:p>
+        </w:tc>
+        <w:tc>
+          <w:tcPr>
+            <w:tcW w:w="1500" w:type="dxa"/>
+          </w:tcPr>
+          <w:p>
+            <w:pPr>
+              <w:pStyle w:val="TableText"/>
+              <w:keepLines/>
+            </w:pPr>
+            <w:r>
+              <w:rPr>
+                <w:sz w:val="18"/>
+                <w:szCs w:val="18"/>
+              </w:rPr>
+              <w:t xml:space="preserve">4/4</w:t>
+            </w:r>
+          </w:p>
+        </w:tc>
+        <w:tc>
+          <w:tcPr>
+            <w:tcW w:w="2400" w:type="dxa"/>
+          </w:tcPr>
+          <w:p>
+            <w:pPr>
+              <w:pStyle w:val="TableText"/>
+              <w:keepLines/>
+            </w:pPr>
+            <w:r>
+              <w:rPr>
+                <w:sz w:val="18"/>
+                <w:szCs w:val="18"/>
+              </w:rPr>
+              <w:t xml:space="preserve">2016-04-30 → 2026-06-30</w:t>
+            </w:r>
+          </w:p>
+        </w:tc>
+      </w:tr>
+      <w:tr>
+        <w:trPr>
+          <w:cantSplit/>
+        </w:trPr>
+        <w:tc>
+          <w:tcPr>
+            <w:tcW w:w="3600" w:type="dxa"/>
+          </w:tcPr>
+          <w:p>
+            <w:pPr>
+              <w:pStyle w:val="TableText"/>
+              <w:keepLines/>
+            </w:pPr>
+            <w:r>
+              <w:rPr>
+                <w:sz w:val="18"/>
+                <w:szCs w:val="18"/>
+              </w:rPr>
+              <w:t xml:space="preserve">Government investment and execution</w:t>
+            </w:r>
+          </w:p>
+        </w:tc>
+        <w:tc>
+          <w:tcPr>
+            <w:tcW w:w="1500" w:type="dxa"/>
+          </w:tcPr>
+          <w:p>
+            <w:pPr>
+              <w:pStyle w:val="TableText"/>
+              <w:keepLines/>
+            </w:pPr>
+            <w:r>
+              <w:rPr>
+                <w:sz w:val="18"/>
+                <w:szCs w:val="18"/>
+              </w:rPr>
+              <w:t xml:space="preserve">ACTIVE</w:t>
+            </w:r>
+          </w:p>
+        </w:tc>
+        <w:tc>
+          <w:tcPr>
+            <w:tcW w:w="1500" w:type="dxa"/>
+          </w:tcPr>
+          <w:p>
+            <w:pPr>
+              <w:pStyle w:val="TableText"/>
+              <w:keepLines/>
+            </w:pPr>
+            <w:r>
+              <w:rPr>
+                <w:sz w:val="18"/>
+                <w:szCs w:val="18"/>
+              </w:rPr>
+              <w:t xml:space="preserve">6/6</w:t>
+            </w:r>
+          </w:p>
+        </w:tc>
+        <w:tc>
+          <w:tcPr>
+            <w:tcW w:w="2400" w:type="dxa"/>
+          </w:tcPr>
+          <w:p>
+            <w:pPr>
+              <w:pStyle w:val="TableText"/>
+              <w:keepLines/>
+            </w:pPr>
+            <w:r>
+              <w:rPr>
+                <w:sz w:val="18"/>
+                <w:szCs w:val="18"/>
+              </w:rPr>
+              <w:t xml:space="preserve">2017-03-31 → 2027-03-31</w:t>
+            </w:r>
+          </w:p>
+        </w:tc>
+      </w:tr>
+      <w:tr>
+        <w:trPr>
+          <w:cantSplit/>
+        </w:trPr>
+        <w:tc>
+          <w:tcPr>
+            <w:tcW w:w="3600" w:type="dxa"/>
+          </w:tcPr>
+          <w:p>
+            <w:pPr>
+              <w:pStyle w:val="TableText"/>
+              <w:keepLines/>
+            </w:pPr>
+            <w:r>
+              <w:rPr>
+                <w:sz w:val="18"/>
+                <w:szCs w:val="18"/>
+              </w:rPr>
+              <w:t xml:space="preserve">Private investment and crowding-in</w:t>
+            </w:r>
+          </w:p>
+        </w:tc>
+        <w:tc>
+          <w:tcPr>
+            <w:tcW w:w="1500" w:type="dxa"/>
+          </w:tcPr>
+          <w:p>
+            <w:pPr>
+              <w:pStyle w:val="TableText"/>
+              <w:keepLines/>
+            </w:pPr>
+            <w:r>
+              <w:rPr>
+                <w:sz w:val="18"/>
+                <w:szCs w:val="18"/>
+              </w:rPr>
+              <w:t xml:space="preserve">ACTIVE</w:t>
+            </w:r>
+          </w:p>
+        </w:tc>
+        <w:tc>
+          <w:tcPr>
+            <w:tcW w:w="1500" w:type="dxa"/>
+          </w:tcPr>
+          <w:p>
+            <w:pPr>
+              <w:pStyle w:val="TableText"/>
+              <w:keepLines/>
+            </w:pPr>
+            <w:r>
+              <w:rPr>
+                <w:sz w:val="18"/>
+                <w:szCs w:val="18"/>
+              </w:rPr>
+              <w:t xml:space="preserve">4/4</w:t>
+            </w:r>
+          </w:p>
+        </w:tc>
+        <w:tc>
+          <w:tcPr>
+            <w:tcW w:w="2400" w:type="dxa"/>
+          </w:tcPr>
+          <w:p>
+            <w:pPr>
+              <w:pStyle w:val="TableText"/>
+              <w:keepLines/>
+            </w:pPr>
+            <w:r>
+              <w:rPr>
+                <w:sz w:val="18"/>
+                <w:szCs w:val="18"/>
+              </w:rPr>
+              <w:t xml:space="preserve">2020-03-31 → 2026-03-31</w:t>
+            </w:r>
+          </w:p>
+        </w:tc>
+      </w:tr>
+      <w:tr>
+        <w:trPr>
+          <w:cantSplit/>
+        </w:trPr>
+        <w:tc>
+          <w:tcPr>
+            <w:tcW w:w="3600" w:type="dxa"/>
+          </w:tcPr>
+          <w:p>
+            <w:pPr>
+              <w:pStyle w:val="TableText"/>
+              <w:keepLines/>
+            </w:pPr>
+            <w:r>
+              <w:rPr>
+                <w:sz w:val="18"/>
+                <w:szCs w:val="18"/>
+              </w:rPr>
+              <w:t xml:space="preserve">Fiscal capacity and debt sustainability</w:t>
+            </w:r>
+          </w:p>
+        </w:tc>
+        <w:tc>
+          <w:tcPr>
+            <w:tcW w:w="1500" w:type="dxa"/>
+          </w:tcPr>
+          <w:p>
+            <w:pPr>
+              <w:pStyle w:val="TableText"/>
+              <w:keepLines/>
+            </w:pPr>
+            <w:r>
+              <w:rPr>
+                <w:sz w:val="18"/>
+                <w:szCs w:val="18"/>
+              </w:rPr>
+              <w:t xml:space="preserve">ACTIVE</w:t>
+            </w:r>
+          </w:p>
+        </w:tc>
+        <w:tc>
+          <w:tcPr>
+            <w:tcW w:w="1500" w:type="dxa"/>
+          </w:tcPr>
+          <w:p>
+            <w:pPr>
+              <w:pStyle w:val="TableText"/>
+              <w:keepLines/>
+            </w:pPr>
+            <w:r>
+              <w:rPr>
+                <w:sz w:val="18"/>
+                <w:szCs w:val="18"/>
+              </w:rPr>
+              <w:t xml:space="preserve">5/5</w:t>
+            </w:r>
+          </w:p>
+        </w:tc>
+        <w:tc>
+          <w:tcPr>
+            <w:tcW w:w="2400" w:type="dxa"/>
+          </w:tcPr>
+          <w:p>
+            <w:pPr>
+              <w:pStyle w:val="TableText"/>
+              <w:keepLines/>
+            </w:pPr>
+            <w:r>
+              <w:rPr>
+                <w:sz w:val="18"/>
+                <w:szCs w:val="18"/>
+              </w:rPr>
+              <w:t xml:space="preserve">1984-03-31 → 2026-03-31</w:t>
+            </w:r>
+          </w:p>
+        </w:tc>
+      </w:tr>
+      <w:tr>
+        <w:trPr>
+          <w:cantSplit/>
+        </w:trPr>
+        <w:tc>
+          <w:tcPr>
+            <w:tcW w:w="3600" w:type="dxa"/>
+          </w:tcPr>
+          <w:p>
+            <w:pPr>
+              <w:pStyle w:val="TableText"/>
+              <w:keepLines/>
+            </w:pPr>
+            <w:r>
+              <w:rPr>
+                <w:sz w:val="18"/>
+                <w:szCs w:val="18"/>
+              </w:rPr>
+              <w:t xml:space="preserve">External competitiveness and resilience</w:t>
+            </w:r>
+          </w:p>
+        </w:tc>
+        <w:tc>
+          <w:tcPr>
+            <w:tcW w:w="1500" w:type="dxa"/>
+          </w:tcPr>
+          <w:p>
+            <w:pPr>
+              <w:pStyle w:val="TableText"/>
+              <w:keepLines/>
+            </w:pPr>
+            <w:r>
+              <w:rPr>
+                <w:sz w:val="18"/>
+                <w:szCs w:val="18"/>
+              </w:rPr>
+              <w:t xml:space="preserve">ACTIVE</w:t>
+            </w:r>
+          </w:p>
+        </w:tc>
+        <w:tc>
+          <w:tcPr>
+            <w:tcW w:w="1500" w:type="dxa"/>
+          </w:tcPr>
+          <w:p>
+            <w:pPr>
+              <w:pStyle w:val="TableText"/>
+              <w:keepLines/>
+            </w:pPr>
+            <w:r>
+              <w:rPr>
+                <w:sz w:val="18"/>
+                <w:szCs w:val="18"/>
+              </w:rPr>
+              <w:t xml:space="preserve">4/4</w:t>
+            </w:r>
+          </w:p>
+        </w:tc>
+        <w:tc>
+          <w:tcPr>
+            <w:tcW w:w="2400" w:type="dxa"/>
+          </w:tcPr>
+          <w:p>
+            <w:pPr>
+              <w:pStyle w:val="TableText"/>
+              <w:keepLines/>
+            </w:pPr>
+            <w:r>
+              <w:rPr>
+                <w:sz w:val="18"/>
+                <w:szCs w:val="18"/>
+              </w:rPr>
+              <w:t xml:space="preserve">2020-01-31 → 2025-07-31</w:t>
+            </w:r>
+          </w:p>
+        </w:tc>
+      </w:tr>
+      <w:tr>
+        <w:trPr>
+          <w:cantSplit/>
+        </w:trPr>
+        <w:tc>
+          <w:tcPr>
+            <w:tcW w:w="3600" w:type="dxa"/>
+          </w:tcPr>
+          <w:p>
+            <w:pPr>
+              <w:pStyle w:val="TableText"/>
+              <w:keepLines/>
+            </w:pPr>
+            <w:r>
+              <w:rPr>
+                <w:sz w:val="18"/>
+                <w:szCs w:val="18"/>
+              </w:rPr>
+              <w:t xml:space="preserve">Human-capital and employment conversion</w:t>
+            </w:r>
+          </w:p>
+        </w:tc>
+        <w:tc>
+          <w:tcPr>
+            <w:tcW w:w="1500" w:type="dxa"/>
+          </w:tcPr>
+          <w:p>
+            <w:pPr>
+              <w:pStyle w:val="TableText"/>
+              <w:keepLines/>
+            </w:pPr>
+            <w:r>
+              <w:rPr>
+                <w:sz w:val="18"/>
+                <w:szCs w:val="18"/>
+              </w:rPr>
+              <w:t xml:space="preserve">ACTIVE</w:t>
+            </w:r>
+          </w:p>
+        </w:tc>
+        <w:tc>
+          <w:tcPr>
+            <w:tcW w:w="1500" w:type="dxa"/>
+          </w:tcPr>
+          <w:p>
+            <w:pPr>
+              <w:pStyle w:val="TableText"/>
+              <w:keepLines/>
+            </w:pPr>
+            <w:r>
+              <w:rPr>
+                <w:sz w:val="18"/>
+                <w:szCs w:val="18"/>
+              </w:rPr>
+              <w:t xml:space="preserve">3/3</w:t>
+            </w:r>
+          </w:p>
+        </w:tc>
+        <w:tc>
+          <w:tcPr>
+            <w:tcW w:w="2400" w:type="dxa"/>
+          </w:tcPr>
+          <w:p>
+            <w:pPr>
+              <w:pStyle w:val="TableText"/>
+              <w:keepLines/>
+            </w:pPr>
+            <w:r>
+              <w:rPr>
+                <w:sz w:val="18"/>
+                <w:szCs w:val="18"/>
+              </w:rPr>
+              <w:t xml:space="preserve">2020-03-31 → 2025-12-31</w:t>
+            </w:r>
+          </w:p>
+        </w:tc>
+      </w:tr>
+      <w:tr>
+        <w:trPr>
+          <w:cantSplit/>
+        </w:trPr>
+        <w:tc>
+          <w:tcPr>
+            <w:tcW w:w="3600" w:type="dxa"/>
+          </w:tcPr>
+          <w:p>
+            <w:pPr>
+              <w:pStyle w:val="TableText"/>
+              <w:keepLines/>
+            </w:pPr>
+            <w:r>
+              <w:rPr>
+                <w:sz w:val="18"/>
+                <w:szCs w:val="18"/>
+              </w:rPr>
+              <w:t xml:space="preserve">Domestic capital buffer against global shocks</w:t>
+            </w:r>
+          </w:p>
+        </w:tc>
+        <w:tc>
+          <w:tcPr>
+            <w:tcW w:w="1500" w:type="dxa"/>
+          </w:tcPr>
+          <w:p>
+            <w:pPr>
+              <w:pStyle w:val="TableText"/>
+              <w:keepLines/>
+            </w:pPr>
+            <w:r>
+              <w:rPr>
+                <w:sz w:val="18"/>
+                <w:szCs w:val="18"/>
+              </w:rPr>
               <w:t xml:space="preserve">PARTIAL</w:t>
             </w:r>
           </w:p>
@@ -784,7 +1246,7 @@
                 <w:sz w:val="18"/>
                 <w:szCs w:val="18"/>
               </w:rPr>
-              <w:t xml:space="preserve">3/4</w:t>
+              <w:t xml:space="preserve">2/5</w:t>
             </w:r>
           </w:p>
         </w:tc>
@@ -802,469 +1264,7 @@
                 <w:sz w:val="18"/>
                 <w:szCs w:val="18"/>
               </w:rPr>
-              <w:t xml:space="preserve">2016-04-30 → 2026-06-30</w:t>
-            </w:r>
-          </w:p>
-        </w:tc>
-      </w:tr>
-      <w:tr>
-        <w:trPr>
-          <w:cantSplit/>
-        </w:trPr>
-        <w:tc>
-          <w:tcPr>
-            <w:tcW w:w="3600" w:type="dxa"/>
-          </w:tcPr>
-          <w:p>
-            <w:pPr>
-              <w:pStyle w:val="TableText"/>
-              <w:keepLines/>
-            </w:pPr>
-            <w:r>
-              <w:rPr>
-                <w:sz w:val="18"/>
-                <w:szCs w:val="18"/>
-              </w:rPr>
-              <w:t xml:space="preserve">Government investment and execution</w:t>
-            </w:r>
-          </w:p>
-        </w:tc>
-        <w:tc>
-          <w:tcPr>
-            <w:tcW w:w="1500" w:type="dxa"/>
-          </w:tcPr>
-          <w:p>
-            <w:pPr>
-              <w:pStyle w:val="TableText"/>
-              <w:keepLines/>
-            </w:pPr>
-            <w:r>
-              <w:rPr>
-                <w:sz w:val="18"/>
-                <w:szCs w:val="18"/>
-              </w:rPr>
-              <w:t xml:space="preserve">ACTIVE</w:t>
-            </w:r>
-          </w:p>
-        </w:tc>
-        <w:tc>
-          <w:tcPr>
-            <w:tcW w:w="1500" w:type="dxa"/>
-          </w:tcPr>
-          <w:p>
-            <w:pPr>
-              <w:pStyle w:val="TableText"/>
-              <w:keepLines/>
-            </w:pPr>
-            <w:r>
-              <w:rPr>
-                <w:sz w:val="18"/>
-                <w:szCs w:val="18"/>
-              </w:rPr>
-              <w:t xml:space="preserve">6/6</w:t>
-            </w:r>
-          </w:p>
-        </w:tc>
-        <w:tc>
-          <w:tcPr>
-            <w:tcW w:w="2400" w:type="dxa"/>
-          </w:tcPr>
-          <w:p>
-            <w:pPr>
-              <w:pStyle w:val="TableText"/>
-              <w:keepLines/>
-            </w:pPr>
-            <w:r>
-              <w:rPr>
-                <w:sz w:val="18"/>
-                <w:szCs w:val="18"/>
-              </w:rPr>
-              <w:t xml:space="preserve">2017-03-31 → 2027-03-31</w:t>
-            </w:r>
-          </w:p>
-        </w:tc>
-      </w:tr>
-      <w:tr>
-        <w:trPr>
-          <w:cantSplit/>
-        </w:trPr>
-        <w:tc>
-          <w:tcPr>
-            <w:tcW w:w="3600" w:type="dxa"/>
-          </w:tcPr>
-          <w:p>
-            <w:pPr>
-              <w:pStyle w:val="TableText"/>
-              <w:keepLines/>
-            </w:pPr>
-            <w:r>
-              <w:rPr>
-                <w:sz w:val="18"/>
-                <w:szCs w:val="18"/>
-              </w:rPr>
-              <w:t xml:space="preserve">Private investment and crowding-in</w:t>
-            </w:r>
-          </w:p>
-        </w:tc>
-        <w:tc>
-          <w:tcPr>
-            <w:tcW w:w="1500" w:type="dxa"/>
-          </w:tcPr>
-          <w:p>
-            <w:pPr>
-              <w:pStyle w:val="TableText"/>
-              <w:keepLines/>
-            </w:pPr>
-            <w:r>
-              <w:rPr>
-                <w:sz w:val="18"/>
-                <w:szCs w:val="18"/>
-              </w:rPr>
-              <w:t xml:space="preserve">PARTIAL</w:t>
-            </w:r>
-          </w:p>
-        </w:tc>
-        <w:tc>
-          <w:tcPr>
-            <w:tcW w:w="1500" w:type="dxa"/>
-          </w:tcPr>
-          <w:p>
-            <w:pPr>
-              <w:pStyle w:val="TableText"/>
-              <w:keepLines/>
-            </w:pPr>
-            <w:r>
-              <w:rPr>
-                <w:sz w:val="18"/>
-                <w:szCs w:val="18"/>
-              </w:rPr>
-              <w:t xml:space="preserve">3/4</w:t>
-            </w:r>
-          </w:p>
-        </w:tc>
-        <w:tc>
-          <w:tcPr>
-            <w:tcW w:w="2400" w:type="dxa"/>
-          </w:tcPr>
-          <w:p>
-            <w:pPr>
-              <w:pStyle w:val="TableText"/>
-              <w:keepLines/>
-            </w:pPr>
-            <w:r>
-              <w:rPr>
-                <w:sz w:val="18"/>
-                <w:szCs w:val="18"/>
-              </w:rPr>
-              <w:t xml:space="preserve">2020-03-31 → 2026-03-31</w:t>
-            </w:r>
-          </w:p>
-        </w:tc>
-      </w:tr>
-      <w:tr>
-        <w:trPr>
-          <w:cantSplit/>
-        </w:trPr>
-        <w:tc>
-          <w:tcPr>
-            <w:tcW w:w="3600" w:type="dxa"/>
-          </w:tcPr>
-          <w:p>
-            <w:pPr>
-              <w:pStyle w:val="TableText"/>
-              <w:keepLines/>
-            </w:pPr>
-            <w:r>
-              <w:rPr>
-                <w:sz w:val="18"/>
-                <w:szCs w:val="18"/>
-              </w:rPr>
-              <w:t xml:space="preserve">Fiscal capacity and debt sustainability</w:t>
-            </w:r>
-          </w:p>
-        </w:tc>
-        <w:tc>
-          <w:tcPr>
-            <w:tcW w:w="1500" w:type="dxa"/>
-          </w:tcPr>
-          <w:p>
-            <w:pPr>
-              <w:pStyle w:val="TableText"/>
-              <w:keepLines/>
-            </w:pPr>
-            <w:r>
-              <w:rPr>
-                <w:sz w:val="18"/>
-                <w:szCs w:val="18"/>
-              </w:rPr>
-              <w:t xml:space="preserve">ACTIVE</w:t>
-            </w:r>
-          </w:p>
-        </w:tc>
-        <w:tc>
-          <w:tcPr>
-            <w:tcW w:w="1500" w:type="dxa"/>
-          </w:tcPr>
-          <w:p>
-            <w:pPr>
-              <w:pStyle w:val="TableText"/>
-              <w:keepLines/>
-            </w:pPr>
-            <w:r>
-              <w:rPr>
-                <w:sz w:val="18"/>
-                <w:szCs w:val="18"/>
-              </w:rPr>
-              <w:t xml:space="preserve">5/5</w:t>
-            </w:r>
-          </w:p>
-        </w:tc>
-        <w:tc>
-          <w:tcPr>
-            <w:tcW w:w="2400" w:type="dxa"/>
-          </w:tcPr>
-          <w:p>
-            <w:pPr>
-              <w:pStyle w:val="TableText"/>
-              <w:keepLines/>
-            </w:pPr>
-            <w:r>
-              <w:rPr>
-                <w:sz w:val="18"/>
-                <w:szCs w:val="18"/>
-              </w:rPr>
-              <w:t xml:space="preserve">1984-03-31 → 2026-03-31</w:t>
-            </w:r>
-          </w:p>
-        </w:tc>
-      </w:tr>
-      <w:tr>
-        <w:trPr>
-          <w:cantSplit/>
-        </w:trPr>
-        <w:tc>
-          <w:tcPr>
-            <w:tcW w:w="3600" w:type="dxa"/>
-          </w:tcPr>
-          <w:p>
-            <w:pPr>
-              <w:pStyle w:val="TableText"/>
-              <w:keepLines/>
-            </w:pPr>
-            <w:r>
-              <w:rPr>
-                <w:sz w:val="18"/>
-                <w:szCs w:val="18"/>
-              </w:rPr>
-              <w:t xml:space="preserve">External competitiveness and resilience</w:t>
-            </w:r>
-          </w:p>
-        </w:tc>
-        <w:tc>
-          <w:tcPr>
-            <w:tcW w:w="1500" w:type="dxa"/>
-          </w:tcPr>
-          <w:p>
-            <w:pPr>
-              <w:pStyle w:val="TableText"/>
-              <w:keepLines/>
-            </w:pPr>
-            <w:r>
-              <w:rPr>
-                <w:sz w:val="18"/>
-                <w:szCs w:val="18"/>
-              </w:rPr>
-              <w:t xml:space="preserve">ACTIVE</w:t>
-            </w:r>
-          </w:p>
-        </w:tc>
-        <w:tc>
-          <w:tcPr>
-            <w:tcW w:w="1500" w:type="dxa"/>
-          </w:tcPr>
-          <w:p>
-            <w:pPr>
-              <w:pStyle w:val="TableText"/>
-              <w:keepLines/>
-            </w:pPr>
-            <w:r>
-              <w:rPr>
-                <w:sz w:val="18"/>
-                <w:szCs w:val="18"/>
-              </w:rPr>
-              <w:t xml:space="preserve">4/4</w:t>
-            </w:r>
-          </w:p>
-        </w:tc>
-        <w:tc>
-          <w:tcPr>
-            <w:tcW w:w="2400" w:type="dxa"/>
-          </w:tcPr>
-          <w:p>
-            <w:pPr>
-              <w:pStyle w:val="TableText"/>
-              <w:keepLines/>
-            </w:pPr>
-            <w:r>
-              <w:rPr>
-                <w:sz w:val="18"/>
-                <w:szCs w:val="18"/>
-              </w:rPr>
-              <w:t xml:space="preserve">2020-01-31 → 2025-07-31</w:t>
-            </w:r>
-          </w:p>
-        </w:tc>
-      </w:tr>
-      <w:tr>
-        <w:trPr>
-          <w:cantSplit/>
-        </w:trPr>
-        <w:tc>
-          <w:tcPr>
-            <w:tcW w:w="3600" w:type="dxa"/>
-          </w:tcPr>
-          <w:p>
-            <w:pPr>
-              <w:pStyle w:val="TableText"/>
-              <w:keepLines/>
-            </w:pPr>
-            <w:r>
-              <w:rPr>
-                <w:sz w:val="18"/>
-                <w:szCs w:val="18"/>
-              </w:rPr>
-              <w:t xml:space="preserve">Human-capital and employment conversion</w:t>
-            </w:r>
-          </w:p>
-        </w:tc>
-        <w:tc>
-          <w:tcPr>
-            <w:tcW w:w="1500" w:type="dxa"/>
-          </w:tcPr>
-          <w:p>
-            <w:pPr>
-              <w:pStyle w:val="TableText"/>
-              <w:keepLines/>
-            </w:pPr>
-            <w:r>
-              <w:rPr>
-                <w:sz w:val="18"/>
-                <w:szCs w:val="18"/>
-              </w:rPr>
-              <w:t xml:space="preserve">ACTIVE</w:t>
-            </w:r>
-          </w:p>
-        </w:tc>
-        <w:tc>
-          <w:tcPr>
-            <w:tcW w:w="1500" w:type="dxa"/>
-          </w:tcPr>
-          <w:p>
-            <w:pPr>
-              <w:pStyle w:val="TableText"/>
-              <w:keepLines/>
-            </w:pPr>
-            <w:r>
-              <w:rPr>
-                <w:sz w:val="18"/>
-                <w:szCs w:val="18"/>
-              </w:rPr>
-              <w:t xml:space="preserve">3/3</w:t>
-            </w:r>
-          </w:p>
-        </w:tc>
-        <w:tc>
-          <w:tcPr>
-            <w:tcW w:w="2400" w:type="dxa"/>
-          </w:tcPr>
-          <w:p>
-            <w:pPr>
-              <w:pStyle w:val="TableText"/>
-              <w:keepLines/>
-            </w:pPr>
-            <w:r>
-              <w:rPr>
-                <w:sz w:val="18"/>
-                <w:szCs w:val="18"/>
-              </w:rPr>
-              <w:t xml:space="preserve">2020-03-31 → 2025-12-31</w:t>
-            </w:r>
-          </w:p>
-        </w:tc>
-      </w:tr>
-      <w:tr>
-        <w:trPr>
-          <w:cantSplit/>
-        </w:trPr>
-        <w:tc>
-          <w:tcPr>
-            <w:tcW w:w="3600" w:type="dxa"/>
-          </w:tcPr>
-          <w:p>
-            <w:pPr>
-              <w:pStyle w:val="TableText"/>
-              <w:keepLines/>
-            </w:pPr>
-            <w:r>
-              <w:rPr>
-                <w:sz w:val="18"/>
-                <w:szCs w:val="18"/>
-              </w:rPr>
-              <w:t xml:space="preserve">Domestic capital buffer against global shocks</w:t>
-            </w:r>
-          </w:p>
-        </w:tc>
-        <w:tc>
-          <w:tcPr>
-            <w:tcW w:w="1500" w:type="dxa"/>
-          </w:tcPr>
-          <w:p>
-            <w:pPr>
-              <w:pStyle w:val="TableText"/>
-              <w:keepLines/>
-            </w:pPr>
-            <w:r>
-              <w:rPr>
-                <w:sz w:val="18"/>
-                <w:szCs w:val="18"/>
-              </w:rPr>
-              <w:t xml:space="preserve">PARTIAL</w:t>
-            </w:r>
-          </w:p>
-        </w:tc>
-        <w:tc>
-          <w:tcPr>
-            <w:tcW w:w="1500" w:type="dxa"/>
-          </w:tcPr>
-          <w:p>
-            <w:pPr>
-              <w:pStyle w:val="TableText"/>
-              <w:keepLines/>
-            </w:pPr>
-            <w:r>
-              <w:rPr>
-                <w:sz w:val="18"/>
-                <w:szCs w:val="18"/>
-              </w:rPr>
-              <w:t xml:space="preserve">2/5</w:t>
-            </w:r>
-          </w:p>
-        </w:tc>
-        <w:tc>
-          <w:tcPr>
-            <w:tcW w:w="2400" w:type="dxa"/>
-          </w:tcPr>
-          <w:p>
-            <w:pPr>
-              <w:pStyle w:val="TableText"/>
-              <w:keepLines/>
-            </w:pPr>
-            <w:r>
-              <w:rPr>
-                <w:sz w:val="18"/>
-                <w:szCs w:val="18"/>
-              </w:rPr>
-              <w:t xml:space="preserve">2026-07-21 → 2026-07-21</w:t>
+              <w:t xml:space="preserve">2026-07-22 → 2026-07-22</w:t>
             </w:r>
           </w:p>
         </w:tc>
@@ -3509,7 +3509,7 @@
     </w:p>
     <w:p>
       <w:r>
-        <w:t xml:space="preserve">NPCI discovery metadata identifies product tabs, year ranges and filters before observations are requested. The World Bank API supplies machine-readable annual denominators. NSE requires a browser-like session established from its official report page before the current-day JSON endpoint is called. Pagination/range completeness, response categories and numerical identities are validated rather than assumed.</w:t>
+        <w:t xml:space="preserve">NPCI discovery metadata identifies product tabs, year ranges and filters before observations are requested. The World Bank API supplies machine-readable annual denominators; a transient API failure may reuse the newest immutable raw snapshot with an explicit runtime warning. NSE requires a browser-like session established from its official report page before the current-day JSON endpoint is called. Pagination/range completeness, response categories and numerical identities are validated rather than assumed.</w:t>
       </w:r>
     </w:p>
     <w:p>
@@ -3523,7 +3523,7 @@
     </w:p>
     <w:p>
       <w:r>
-        <w:t xml:space="preserve">The RBI extractor discovers official table links from the Handbook and parses the substantive HTML table. A dependency-free XLSX reader also exists, but live unattended builds use the official HTML representation because the rbidocs workbook host may block automated retrieval. Table number, headers, units and row identity are part of the extraction contract.</w:t>
+        <w:t xml:space="preserve">The RBI Handbook extractor discovers official table links and parses substantive HTML tables. OBICUS uses the same evidence-first pattern against RBI's quarterly-publication index, then selects Table 1 Capacity Utilisation by title and exact headers. A dependency-free XLSX reader also exists, but live unattended builds use official HTML where the rbidocs workbook host may block automated retrieval. Table identity, headers, units and row identity are extraction contracts.</w:t>
       </w:r>
     </w:p>
     <w:p>
@@ -3537,7 +3537,7 @@
     </w:p>
     <w:p>
       <w:r>
-        <w:t xml:space="preserve">The raw PDF is checksum-archived first. pdftotext -layout creates a stable positional text representation for parsing. The extractor looks for exact statement/table labels and expected year columns, then applies table-specific rules. A visually plausible number from the wrong row is considered a hard extraction error, not an acceptable approximation.</w:t>
+        <w:t xml:space="preserve">The raw PDF is checksum-archived first. pdftotext -layout creates a stable positional text representation for parsing. Extractors look for exact statement/table labels and expected year columns, then apply table-specific rules. The GST adapter additionally reconciles a rounded historical PIB series with exact provisional totals from the GST Portal. A visually plausible number from the wrong row is a hard extraction error, not an acceptable approximation.</w:t>
       </w:r>
     </w:p>
     <w:p>
@@ -5434,19 +5434,19 @@
         <w:spacing w:before="120" w:after="160"/>
         <w:ind w:left="180"/>
         <w:pBdr>
-          <w:left w:val="single" w:sz="18" w:space="10" w:color="D97706"/>
+          <w:left w:val="single" w:sz="18" w:space="10" w:color="2E7D6B"/>
         </w:pBdr>
-        <w:shd w:val="clear" w:color="auto" w:fill="FFF7ED"/>
+        <w:shd w:val="clear" w:color="auto" w:fill="ECFDF5"/>
       </w:pPr>
       <w:r>
         <w:rPr>
           <w:b/>
-          <w:color w:val="D97706"/>
+          <w:color w:val="2E7D6B"/>
         </w:rPr>
         <w:t xml:space="preserve">Implementation status  </w:t>
       </w:r>
       <w:r>
-        <w:t xml:space="preserve">Partial — UPI metrics are populated; GST evidence remains planned.</w:t>
+        <w:t xml:space="preserve">Active — all four registered UPI and GST series have observations.</w:t>
       </w:r>
     </w:p>
     <w:p>
@@ -5686,6 +5686,129 @@
           </w:p>
         </w:tc>
       </w:tr>
+      <w:tr>
+        <w:trPr>
+          <w:cantSplit/>
+        </w:trPr>
+        <w:tc>
+          <w:tcPr>
+            <w:tcW w:w="3000" w:type="dxa"/>
+          </w:tcPr>
+          <w:p>
+            <w:pPr>
+              <w:pStyle w:val="TableText"/>
+              <w:keepLines/>
+            </w:pPr>
+            <w:r>
+              <w:rPr>
+                <w:sz w:val="18"/>
+                <w:szCs w:val="18"/>
+              </w:rPr>
+              <w:t xml:space="preserve">Ministry of Finance / PIB GST history</w:t>
+            </w:r>
+          </w:p>
+        </w:tc>
+        <w:tc>
+          <w:tcPr>
+            <w:tcW w:w="6000" w:type="dxa"/>
+          </w:tcPr>
+          <w:p>
+            <w:pPr>
+              <w:pStyle w:val="TableText"/>
+              <w:keepLines/>
+            </w:pPr>
+            <w:r>
+              <w:rPr>
+                <w:sz w:val="18"/>
+                <w:szCs w:val="18"/>
+              </w:rPr>
+              <w:t xml:space="preserve">Fiscal-year gross GST revenue for FY2020–21 through FY2023–24, reported in lakh crore.</w:t>
+            </w:r>
+          </w:p>
+        </w:tc>
+      </w:tr>
+      <w:tr>
+        <w:trPr>
+          <w:cantSplit/>
+        </w:trPr>
+        <w:tc>
+          <w:tcPr>
+            <w:tcW w:w="3000" w:type="dxa"/>
+          </w:tcPr>
+          <w:p>
+            <w:pPr>
+              <w:pStyle w:val="TableText"/>
+              <w:keepLines/>
+            </w:pPr>
+            <w:r>
+              <w:rPr>
+                <w:sz w:val="18"/>
+                <w:szCs w:val="18"/>
+              </w:rPr>
+              <w:t xml:space="preserve">GST Portal March 2025 collection report</w:t>
+            </w:r>
+          </w:p>
+        </w:tc>
+        <w:tc>
+          <w:tcPr>
+            <w:tcW w:w="6000" w:type="dxa"/>
+          </w:tcPr>
+          <w:p>
+            <w:pPr>
+              <w:pStyle w:val="TableText"/>
+              <w:keepLines/>
+            </w:pPr>
+            <w:r>
+              <w:rPr>
+                <w:sz w:val="18"/>
+                <w:szCs w:val="18"/>
+              </w:rPr>
+              <w:t xml:space="preserve">Exact provisional gross GST totals for FY2023–24 and FY2024–25, including CGST, SGST, IGST and cess.</w:t>
+            </w:r>
+          </w:p>
+        </w:tc>
+      </w:tr>
+      <w:tr>
+        <w:trPr>
+          <w:cantSplit/>
+        </w:trPr>
+        <w:tc>
+          <w:tcPr>
+            <w:tcW w:w="3000" w:type="dxa"/>
+          </w:tcPr>
+          <w:p>
+            <w:pPr>
+              <w:pStyle w:val="TableText"/>
+              <w:keepLines/>
+            </w:pPr>
+            <w:r>
+              <w:rPr>
+                <w:sz w:val="18"/>
+                <w:szCs w:val="18"/>
+              </w:rPr>
+              <w:t xml:space="preserve">RBI Handbook, Table 1</w:t>
+            </w:r>
+          </w:p>
+        </w:tc>
+        <w:tc>
+          <w:tcPr>
+            <w:tcW w:w="6000" w:type="dxa"/>
+          </w:tcPr>
+          <w:p>
+            <w:pPr>
+              <w:pStyle w:val="TableText"/>
+              <w:keepLines/>
+            </w:pPr>
+            <w:r>
+              <w:rPr>
+                <w:sz w:val="18"/>
+                <w:szCs w:val="18"/>
+              </w:rPr>
+              <w:t xml:space="preserve">Matching fiscal-year nominal GDP at current prices, with RBI/NSO observation status retained.</w:t>
+            </w:r>
+          </w:p>
+        </w:tc>
+      </w:tr>
     </w:tbl>
     <w:p>
       <w:pPr>
@@ -5764,6 +5887,57 @@
       </w:r>
     </w:p>
     <w:p>
+      <w:r>
+        <w:t xml:space="preserve">Official link: </w:t>
+      </w:r>
+      <w:hyperlink r:id="rId24" w:history="1">
+        <w:r>
+          <w:rPr>
+            <w:color w:val="0563C1"/>
+            <w:rStyle w:val="Hyperlink"/>
+          </w:rPr>
+          <w:t xml:space="preserve">Ministry of Finance / PIB GST history</w:t>
+        </w:r>
+      </w:hyperlink>
+      <w:r>
+        <w:t xml:space="preserve"/>
+      </w:r>
+    </w:p>
+    <w:p>
+      <w:r>
+        <w:t xml:space="preserve">Official link: </w:t>
+      </w:r>
+      <w:hyperlink r:id="rId25" w:history="1">
+        <w:r>
+          <w:rPr>
+            <w:color w:val="0563C1"/>
+            <w:rStyle w:val="Hyperlink"/>
+          </w:rPr>
+          <w:t xml:space="preserve">GST Portal March 2025 collection report</w:t>
+        </w:r>
+      </w:hyperlink>
+      <w:r>
+        <w:t xml:space="preserve"/>
+      </w:r>
+    </w:p>
+    <w:p>
+      <w:r>
+        <w:t xml:space="preserve">Official link: </w:t>
+      </w:r>
+      <w:hyperlink r:id="rId26" w:history="1">
+        <w:r>
+          <w:rPr>
+            <w:color w:val="0563C1"/>
+            <w:rStyle w:val="Hyperlink"/>
+          </w:rPr>
+          <w:t xml:space="preserve">RBI Handbook, Table 1</w:t>
+        </w:r>
+      </w:hyperlink>
+      <w:r>
+        <w:t xml:space="preserve"/>
+      </w:r>
+    </w:p>
+    <w:p>
       <w:pPr>
         <w:pStyle w:val="Heading2"/>
         <w:keepNext/>
@@ -5774,7 +5948,7 @@
     </w:p>
     <w:p>
       <w:r>
-        <w:t xml:space="preserve">The NPCI extractor first obtains the official tab definitions, then requests every advertised year range and page. It stores the returned metadata and observations as checksum-addressed raw JSON. Calendar-year World Bank denominators are joined without interpolation. Missing denominator years remain null.</w:t>
+        <w:t xml:space="preserve">The NPCI extractor first obtains the official tab definitions, then requests every advertised year range and page. Calendar-year World Bank denominators are joined without interpolation. For tax capacity, official PDFs are checksum-archived and parsed; fiscal-year gross-GST YoY growth is calculated and matching fiscal-year nominal-GDP YoY growth is subtracted. Exact GST Portal totals supersede rounded PIB totals where both cover the same year, and the provisional label is retained.</w:t>
       </w:r>
     </w:p>
     <w:p>
@@ -6325,20 +6499,20 @@
                 <w:sz w:val="16"/>
                 <w:szCs w:val="16"/>
               </w:rPr>
-              <w:t xml:space="preserve">Gross GST receipts; nominal GDP</w:t>
-            </w:r>
-          </w:p>
-          <w:p>
-            <w:pPr>
-              <w:pStyle w:val="TableText"/>
-              <w:keepLines/>
-            </w:pPr>
-            <w:r>
-              <w:rPr>
-                <w:sz w:val="16"/>
-                <w:szCs w:val="16"/>
-              </w:rPr>
-              <w:t xml:space="preserve">Source: GST portal + MoSPI</w:t>
+              <w:t xml:space="preserve">Fiscal-year gross GST revenue (CGST, SGST, IGST and cess); fiscal-year nominal GDP</w:t>
+            </w:r>
+          </w:p>
+          <w:p>
+            <w:pPr>
+              <w:pStyle w:val="TableText"/>
+              <w:keepLines/>
+            </w:pPr>
+            <w:r>
+              <w:rPr>
+                <w:sz w:val="16"/>
+                <w:szCs w:val="16"/>
+              </w:rPr>
+              <w:t xml:space="preserve">Source: GST Portal / Ministry of Finance + RBI/NSO</w:t>
             </w:r>
           </w:p>
         </w:tc>
@@ -6356,7 +6530,7 @@
                 <w:sz w:val="16"/>
                 <w:szCs w:val="16"/>
               </w:rPr>
-              <w:t xml:space="preserve">gst_yoy_pct - nominal_gdp_yoy_pct</w:t>
+              <w:t xml:space="preserve">gross_gst_revenue_yoy_pct - nominal_gdp_yoy_pct</w:t>
             </w:r>
           </w:p>
           <w:p>
@@ -6387,20 +6561,20 @@
                 <w:sz w:val="16"/>
                 <w:szCs w:val="16"/>
               </w:rPr>
-              <w:t xml:space="preserve">Annual gross GST growth less nominal GDP growth.</w:t>
-            </w:r>
-          </w:p>
-          <w:p>
-            <w:pPr>
-              <w:pStyle w:val="TableText"/>
-              <w:keepLines/>
-            </w:pPr>
-            <w:r>
-              <w:rPr>
-                <w:sz w:val="16"/>
-                <w:szCs w:val="16"/>
-              </w:rPr>
-              <w:t xml:space="preserve">LIMIT: Tax-rate, enforcement, refund and import changes also affect GST receipts.</w:t>
+              <w:t xml:space="preserve">Annual gross GST-revenue growth less matching fiscal-year nominal-GDP growth.</w:t>
+            </w:r>
+          </w:p>
+          <w:p>
+            <w:pPr>
+              <w:pStyle w:val="TableText"/>
+              <w:keepLines/>
+            </w:pPr>
+            <w:r>
+              <w:rPr>
+                <w:sz w:val="16"/>
+                <w:szCs w:val="16"/>
+              </w:rPr>
+              <w:t xml:space="preserve">LIMIT: Tax-rate, enforcement, refunds, imports and collection timing also affect gross GST receipts.</w:t>
             </w:r>
           </w:p>
         </w:tc>
@@ -6793,7 +6967,7 @@
                 <w:sz w:val="17"/>
                 <w:szCs w:val="17"/>
               </w:rPr>
-              <w:t xml:space="preserve">0/0</w:t>
+              <w:t xml:space="preserve">4/4</w:t>
             </w:r>
           </w:p>
         </w:tc>
@@ -6811,7 +6985,7 @@
                 <w:sz w:val="17"/>
                 <w:szCs w:val="17"/>
               </w:rPr>
-              <w:t xml:space="preserve">No rows yet</w:t>
+              <w:t xml:space="preserve">2022-03-31 → 2025-03-31</w:t>
             </w:r>
           </w:p>
         </w:tc>
@@ -6829,7 +7003,7 @@
                 <w:sz w:val="17"/>
                 <w:szCs w:val="17"/>
               </w:rPr>
-              <w:t xml:space="preserve">Not populated</w:t>
+              <w:t xml:space="preserve">-0.33 pp on 2025-03-31</w:t>
             </w:r>
           </w:p>
         </w:tc>
@@ -6854,7 +7028,7 @@
     </w:p>
     <w:p>
       <w:r>
-        <w:t xml:space="preserve">Together the series describe the intensity and ticket size of digital payments and the turnover of the network relative to the economy. They do not count unique users, distinguish person-to-person from merchant payments, or identify a causal effect on formalisation or tax compliance.</w:t>
+        <w:t xml:space="preserve">UPI series describe payment intensity, ticket size and network turnover relative to the economy. The GST growth gap says whether gross receipts grew faster or slower than nominal GDP in percentage points; it is not a tax-buoyancy estimate because it does not control for rate, base, import, refund, enforcement or timing changes. None of these series identifies a causal effect on formalisation.</w:t>
       </w:r>
     </w:p>
     <w:p>
@@ -6875,7 +7049,7 @@
         <w:t xml:space="preserve">Critical reading note  </w:t>
       </w:r>
       <w:r>
-        <w:t xml:space="preserve">UPI value as a percentage of GDP is a turnover-to-value-added comparison. Payments can circulate the same rupee many times; 86.8% therefore does not mean that UPI ‘produced’ or ‘covered’ 86.8% of GDP.</w:t>
+        <w:t xml:space="preserve">UPI value/GDP is a turnover-to-value-added comparison: payments can circulate the same rupee many times. The GST gap is a difference between two growth rates, so +2 means GST grew two percentage points faster than nominal GDP, not that GST revenue equals 2% of GDP.</w:t>
       </w:r>
     </w:p>
     <w:p>
@@ -7106,7 +7280,7 @@
       <w:r>
         <w:t xml:space="preserve">Official link: </w:t>
       </w:r>
-      <w:hyperlink r:id="rId24" w:history="1">
+      <w:hyperlink r:id="rId27" w:history="1">
         <w:r>
           <w:rPr>
             <w:color w:val="0563C1"/>
@@ -7123,7 +7297,7 @@
       <w:r>
         <w:t xml:space="preserve">Official link: </w:t>
       </w:r>
-      <w:hyperlink r:id="rId25" w:history="1">
+      <w:hyperlink r:id="rId28" w:history="1">
         <w:r>
           <w:rPr>
             <w:color w:val="0563C1"/>
@@ -8708,19 +8882,19 @@
         <w:spacing w:before="120" w:after="160"/>
         <w:ind w:left="180"/>
         <w:pBdr>
-          <w:left w:val="single" w:sz="18" w:space="10" w:color="D97706"/>
+          <w:left w:val="single" w:sz="18" w:space="10" w:color="2E7D6B"/>
         </w:pBdr>
-        <w:shd w:val="clear" w:color="auto" w:fill="FFF7ED"/>
+        <w:shd w:val="clear" w:color="auto" w:fill="ECFDF5"/>
       </w:pPr>
       <w:r>
         <w:rPr>
           <w:b/>
-          <w:color w:val="D97706"/>
+          <w:color w:val="2E7D6B"/>
         </w:rPr>
         <w:t xml:space="preserve">Implementation status  </w:t>
       </w:r>
       <w:r>
-        <w:t xml:space="preserve">Partial — national-accounts and lagged public-CapEx series are populated; RBI OBICUS capacity utilisation remains planned.</w:t>
+        <w:t xml:space="preserve">Active — national-accounts, lagged public-CapEx and RBI OBICUS capacity-utilisation series are populated.</w:t>
       </w:r>
     </w:p>
     <w:p>
@@ -8914,7 +9088,7 @@
                 <w:sz w:val="18"/>
                 <w:szCs w:val="18"/>
               </w:rPr>
-              <w:t xml:space="preserve">Planned: quarterly aggregate manufacturing capacity utilisation.</w:t>
+              <w:t xml:space="preserve">Quarterly number of responding companies plus unadjusted and seasonally adjusted aggregate manufacturing capacity utilisation. The published series uses the unadjusted aggregate.</w:t>
             </w:r>
           </w:p>
         </w:tc>
@@ -8932,7 +9106,7 @@
       <w:r>
         <w:t xml:space="preserve">Official link: </w:t>
       </w:r>
-      <w:hyperlink r:id="rId26" w:history="1">
+      <w:hyperlink r:id="rId29" w:history="1">
         <w:r>
           <w:rPr>
             <w:color w:val="0563C1"/>
@@ -8949,7 +9123,7 @@
       <w:r>
         <w:t xml:space="preserve">Official link: </w:t>
       </w:r>
-      <w:hyperlink r:id="rId27" w:history="1">
+      <w:hyperlink r:id="rId30" w:history="1">
         <w:r>
           <w:rPr>
             <w:color w:val="0563C1"/>
@@ -8966,7 +9140,7 @@
       <w:r>
         <w:t xml:space="preserve">Official link: </w:t>
       </w:r>
-      <w:hyperlink r:id="rId28" w:history="1">
+      <w:hyperlink r:id="rId31" w:history="1">
         <w:r>
           <w:rPr>
             <w:color w:val="0563C1"/>
@@ -8990,7 +9164,7 @@
     </w:p>
     <w:p>
       <w:r>
-        <w:t xml:space="preserve">Private corporate GFCF is constructed as private non-financial corporation GFCF plus private financial corporation GFCF. It is divided by nominal GDP or total GFCF from the same release and base-year system. The public-CapEx comparison is an explicit one-fiscal-year lag; it is not fitted or selected by a causal model.</w:t>
+        <w:t xml:space="preserve">Private corporate GFCF is constructed as private non-financial corporation GFCF plus private financial corporation GFCF. It is divided by nominal GDP or total GFCF from the same release and base-year system. The public-CapEx comparison is an explicit one-fiscal-year lag. The OBICUS extractor discovers RBI's latest quarterly publication, selects Table 1 by title and exact headers, and publishes the unadjusted capacity-utilisation column with fiscal-quarter boundaries.</w:t>
       </w:r>
     </w:p>
     <w:p>
@@ -9932,7 +10106,7 @@
                 <w:sz w:val="17"/>
                 <w:szCs w:val="17"/>
               </w:rPr>
-              <w:t xml:space="preserve">0/0</w:t>
+              <w:t xml:space="preserve">5/5</w:t>
             </w:r>
           </w:p>
         </w:tc>
@@ -9950,7 +10124,7 @@
                 <w:sz w:val="17"/>
                 <w:szCs w:val="17"/>
               </w:rPr>
-              <w:t xml:space="preserve">No rows yet</w:t>
+              <w:t xml:space="preserve">2024-12-31 → 2025-12-31</w:t>
             </w:r>
           </w:p>
         </w:tc>
@@ -9968,7 +10142,7 @@
                 <w:sz w:val="17"/>
                 <w:szCs w:val="17"/>
               </w:rPr>
-              <w:t xml:space="preserve">Not populated</w:t>
+              <w:t xml:space="preserve">75.60% on 2025-12-31</w:t>
             </w:r>
           </w:p>
         </w:tc>
@@ -10070,7 +10244,7 @@
     </w:p>
     <w:p>
       <w:r>
-        <w:t xml:space="preserve">These measures show how much fixed-capital formation is attributed to private corporations and its share of economy-wide investment. They exclude household-sector investment and should not be described as the entire private sector. A visual association with lagged public CapEx is a hypothesis-generating comparison, not a crowding-in estimate.</w:t>
+        <w:t xml:space="preserve">The investment ratios show how much fixed-capital formation is attributed to private corporations and its share of economy-wide investment. OBICUS adds a survey measure of how intensively responding manufacturers use installed capacity. It is not the investment rate, and changes may reflect demand or production schedules rather than new capacity. A visual association with lagged public CapEx remains hypothesis-generating, not causal.</w:t>
       </w:r>
     </w:p>
     <w:p>
@@ -10091,7 +10265,7 @@
         <w:t xml:space="preserve">Critical reading note  </w:t>
       </w:r>
       <w:r>
-        <w:t xml:space="preserve">Base-year revisions can change levels, historical growth and institutional allocation. Numerators and denominators are therefore kept within the same MoSPI vintage rather than mixed across releases.</w:t>
+        <w:t xml:space="preserve">MoSPI numerators and denominators stay within one base-year vintage. OBICUS is a voluntary survey, its respondent count changes by quarter, and the published unadjusted series can contain seasonality; the seasonally adjusted column is retained in extraction evidence but is not silently substituted.</w:t>
       </w:r>
     </w:p>
     <w:p>
@@ -10322,7 +10496,7 @@
       <w:r>
         <w:t xml:space="preserve">Official link: </w:t>
       </w:r>
-      <w:hyperlink r:id="rId29" w:history="1">
+      <w:hyperlink r:id="rId32" w:history="1">
         <w:r>
           <w:rPr>
             <w:color w:val="0563C1"/>
@@ -10339,7 +10513,7 @@
       <w:r>
         <w:t xml:space="preserve">Official link: </w:t>
       </w:r>
-      <w:hyperlink r:id="rId30" w:history="1">
+      <w:hyperlink r:id="rId33" w:history="1">
         <w:r>
           <w:rPr>
             <w:color w:val="0563C1"/>
@@ -11983,7 +12157,7 @@
       <w:r>
         <w:t xml:space="preserve">Official link: </w:t>
       </w:r>
-      <w:hyperlink r:id="rId31" w:history="1">
+      <w:hyperlink r:id="rId34" w:history="1">
         <w:r>
           <w:rPr>
             <w:color w:val="0563C1"/>
@@ -12000,7 +12174,7 @@
       <w:r>
         <w:t xml:space="preserve">Official link: </w:t>
       </w:r>
-      <w:hyperlink r:id="rId32" w:history="1">
+      <w:hyperlink r:id="rId35" w:history="1">
         <w:r>
           <w:rPr>
             <w:color w:val="0563C1"/>
@@ -12017,7 +12191,7 @@
       <w:r>
         <w:t xml:space="preserve">Official link: </w:t>
       </w:r>
-      <w:hyperlink r:id="rId33" w:history="1">
+      <w:hyperlink r:id="rId36" w:history="1">
         <w:r>
           <w:rPr>
             <w:color w:val="0563C1"/>
@@ -12034,7 +12208,7 @@
       <w:r>
         <w:t xml:space="preserve">Official link: </w:t>
       </w:r>
-      <w:hyperlink r:id="rId34" w:history="1">
+      <w:hyperlink r:id="rId37" w:history="1">
         <w:r>
           <w:rPr>
             <w:color w:val="0563C1"/>
@@ -13390,7 +13564,7 @@
       <w:r>
         <w:t xml:space="preserve">Official link: </w:t>
       </w:r>
-      <w:hyperlink r:id="rId35" w:history="1">
+      <w:hyperlink r:id="rId38" w:history="1">
         <w:r>
           <w:rPr>
             <w:color w:val="0563C1"/>
@@ -13407,7 +13581,7 @@
       <w:r>
         <w:t xml:space="preserve">Official link: </w:t>
       </w:r>
-      <w:hyperlink r:id="rId36" w:history="1">
+      <w:hyperlink r:id="rId39" w:history="1">
         <w:r>
           <w:rPr>
             <w:color w:val="0563C1"/>
@@ -14386,12 +14560,12 @@
         <w:t xml:space="preserve">Implementation status  </w:t>
       </w:r>
       <w:r>
-        <w:t xml:space="preserve">Partial — one archived NSE trading day is available; monthly history, rolling windows and shock-event estimates require continued daily accumulation.</w:t>
-      </w:r>
-    </w:p>
-    <w:p>
-      <w:r>
-        <w:t xml:space="preserve">Published artifact: data/processed/capital-resilience/institutional-flows.json. Contract: dated_multi_series.schema.json. Declared frequency: monthly. Artifact coverage: 2026-07-21 to 2026-07-21.</w:t>
+        <w:t xml:space="preserve">Partial — two archived NSE trading days are available; rolling windows and shock-event estimates require continued daily accumulation.</w:t>
+      </w:r>
+    </w:p>
+    <w:p>
+      <w:r>
+        <w:t xml:space="preserve">Published artifact: data/processed/capital-resilience/institutional-flows.json. Contract: dated_multi_series.schema.json. Declared frequency: monthly. Artifact coverage: 2026-07-22 to 2026-07-22.</w:t>
       </w:r>
     </w:p>
     <w:p>
@@ -14557,7 +14731,7 @@
       <w:r>
         <w:t xml:space="preserve">Official link: </w:t>
       </w:r>
-      <w:hyperlink r:id="rId37" w:history="1">
+      <w:hyperlink r:id="rId40" w:history="1">
         <w:r>
           <w:rPr>
             <w:color w:val="0563C1"/>
@@ -14574,7 +14748,7 @@
       <w:r>
         <w:t xml:space="preserve">Official link: </w:t>
       </w:r>
-      <w:hyperlink r:id="rId38" w:history="1">
+      <w:hyperlink r:id="rId41" w:history="1">
         <w:r>
           <w:rPr>
             <w:color w:val="0563C1"/>
@@ -15533,7 +15707,7 @@
                 <w:sz w:val="17"/>
                 <w:szCs w:val="17"/>
               </w:rPr>
-              <w:t xml:space="preserve">2026-07-21 → 2026-07-21</w:t>
+              <w:t xml:space="preserve">2026-07-22 → 2026-07-22</w:t>
             </w:r>
           </w:p>
         </w:tc>
@@ -15551,7 +15725,7 @@
                 <w:sz w:val="17"/>
                 <w:szCs w:val="17"/>
               </w:rPr>
-              <w:t xml:space="preserve">₹-656.88 crore on 2026-07-21</w:t>
+              <w:t xml:space="preserve">₹-1,075.14 crore on 2026-07-22</w:t>
             </w:r>
           </w:p>
         </w:tc>
@@ -15610,7 +15784,7 @@
                 <w:sz w:val="17"/>
                 <w:szCs w:val="17"/>
               </w:rPr>
-              <w:t xml:space="preserve">2026-07-21 → 2026-07-21</w:t>
+              <w:t xml:space="preserve">2026-07-22 → 2026-07-22</w:t>
             </w:r>
           </w:p>
         </w:tc>
@@ -15628,7 +15802,7 @@
                 <w:sz w:val="17"/>
                 <w:szCs w:val="17"/>
               </w:rPr>
-              <w:t xml:space="preserve">₹1,650.16 crore on 2026-07-21</w:t>
+              <w:t xml:space="preserve">₹830.96 crore on 2026-07-22</w:t>
             </w:r>
           </w:p>
         </w:tc>
@@ -15687,7 +15861,7 @@
                 <w:sz w:val="17"/>
                 <w:szCs w:val="17"/>
               </w:rPr>
-              <w:t xml:space="preserve">2026-07-21 → 2026-07-21</w:t>
+              <w:t xml:space="preserve">2026-07-22 → 2026-07-22</w:t>
             </w:r>
           </w:p>
         </w:tc>
@@ -15764,7 +15938,7 @@
                 <w:sz w:val="17"/>
                 <w:szCs w:val="17"/>
               </w:rPr>
-              <w:t xml:space="preserve">2026-07-21 → 2026-07-21</w:t>
+              <w:t xml:space="preserve">2026-07-22 → 2026-07-22</w:t>
             </w:r>
           </w:p>
         </w:tc>
@@ -15841,7 +16015,7 @@
                 <w:sz w:val="17"/>
                 <w:szCs w:val="17"/>
               </w:rPr>
-              <w:t xml:space="preserve">2026-07-21 → 2026-07-21</w:t>
+              <w:t xml:space="preserve">2026-07-22 → 2026-07-22</w:t>
             </w:r>
           </w:p>
         </w:tc>
@@ -17215,7 +17389,7 @@
     </w:p>
     <w:p>
       <w:r>
-        <w:t xml:space="preserve">At the implementation snapshot, the backend suite reported 26 passing tests and one skipped optional pandas/yfinance test. The frontend TypeScript/Vite build and static-data validation also passed. Tests cover canonical periods/status, registry contracts, formulas and rolling-window behaviour, schema validation, exporter atomicity, focused builders/catalogue logic and source-specific parsing fixtures. A successful test run does not replace a data-review check for revisions or economic plausibility.</w:t>
+        <w:t xml:space="preserve">At the implementation snapshot, the backend suite reported 28 passing tests and one skipped optional pandas/yfinance test. The frontend TypeScript/Vite build and static-data validation also passed. Tests cover canonical periods/status, registry contracts, formulas and rolling-window behaviour, schema validation, exporter atomicity, focused builders/catalogue logic, and source-specific GST/OBICUS parsing fixtures. A successful test run does not replace a data-review check for revisions or economic plausibility.</w:t>
       </w:r>
     </w:p>
     <w:p>
@@ -17275,7 +17449,7 @@
         <w:t xml:space="preserve">•</w:t>
       </w:r>
       <w:r>
-        <w:t xml:space="preserve">  Quarterly: rebuild RBI balance-of-payments/GDP and, once implemented, OBICUS capacity utilisation.</w:t>
+        <w:t xml:space="preserve">  Quarterly: rebuild RBI balance-of-payments/GDP and OBICUS capacity utilisation after each official release.</w:t>
       </w:r>
     </w:p>
     <w:p>
@@ -17292,7 +17466,7 @@
         <w:t xml:space="preserve">•</w:t>
       </w:r>
       <w:r>
-        <w:t xml:space="preserve">  Annual/release-driven: rebuild Budget vintages, RBI fiscal/debt, MoSPI national accounts, AISHE and PLFS after official releases.</w:t>
+        <w:t xml:space="preserve">  Annual/release-driven: rebuild Budget vintages, RBI fiscal/debt, MoSPI national accounts, GST fiscal-year totals, AISHE and PLFS after official releases.</w:t>
       </w:r>
     </w:p>
     <w:p>
@@ -17457,7 +17631,7 @@
                 <w:sz w:val="18"/>
                 <w:szCs w:val="18"/>
               </w:rPr>
-              <w:t xml:space="preserve">GST gross-receipts series and gst_growth_gap</w:t>
+              <w:t xml:space="preserve">Historical institutional-flow archive</w:t>
             </w:r>
           </w:p>
         </w:tc>
@@ -17475,7 +17649,7 @@
                 <w:sz w:val="18"/>
                 <w:szCs w:val="18"/>
               </w:rPr>
-              <w:t xml:space="preserve">An official, reproducible GST series with clear period/vintage semantics joined to matching nominal GDP; digital lens becomes active.</w:t>
+              <w:t xml:space="preserve">Scheduled daily NSE collection has enough consecutive months for complete 12-month windows; month-completeness is explicit.</w:t>
             </w:r>
           </w:p>
         </w:tc>
@@ -17516,7 +17690,7 @@
                 <w:sz w:val="18"/>
                 <w:szCs w:val="18"/>
               </w:rPr>
-              <w:t xml:space="preserve">RBI OBICUS manufacturing capacity utilisation</w:t>
+              <w:t xml:space="preserve">Shock-event analysis</w:t>
             </w:r>
           </w:p>
         </w:tc>
@@ -17534,7 +17708,7 @@
                 <w:sz w:val="18"/>
                 <w:szCs w:val="18"/>
               </w:rPr>
-              <w:t xml:space="preserve">Official quarterly series, immutable raw snapshots, parser tests and populated capacity series; private lens becomes active.</w:t>
+              <w:t xml:space="preserve">The configured 2018 EM sell-off, COVID-19 and 2022 tightening windows can be populated from adequate flow/market history and validated against event_study.schema.json.</w:t>
             </w:r>
           </w:p>
         </w:tc>
@@ -17575,7 +17749,7 @@
                 <w:sz w:val="18"/>
                 <w:szCs w:val="18"/>
               </w:rPr>
-              <w:t xml:space="preserve">Historical institutional-flow archive</w:t>
+              <w:t xml:space="preserve">Longer official GST and OBICUS history</w:t>
             </w:r>
           </w:p>
         </w:tc>
@@ -17593,7 +17767,7 @@
                 <w:sz w:val="18"/>
                 <w:szCs w:val="18"/>
               </w:rPr>
-              <w:t xml:space="preserve">Scheduled daily NSE collection has enough consecutive months for complete 12-month windows; month-completeness is explicit.</w:t>
+              <w:t xml:space="preserve">Additional compatible official vintages extend the short current histories without mixing definitions or overwriting source status.</w:t>
             </w:r>
           </w:p>
         </w:tc>
@@ -17634,7 +17808,7 @@
                 <w:sz w:val="18"/>
                 <w:szCs w:val="18"/>
               </w:rPr>
-              <w:t xml:space="preserve">Shock-event analysis</w:t>
+              <w:t xml:space="preserve">Frontend performance</w:t>
             </w:r>
           </w:p>
         </w:tc>
@@ -17652,7 +17826,7 @@
                 <w:sz w:val="18"/>
                 <w:szCs w:val="18"/>
               </w:rPr>
-              <w:t xml:space="preserve">The configured 2018 EM sell-off, COVID-19 and 2022 tightening windows can be populated from adequate flow/market history and validated against event_study.schema.json.</w:t>
+              <w:t xml:space="preserve">Route/chart code splitting or other bundle reduction removes the large-chunk warning without weakening validation.</w:t>
             </w:r>
           </w:p>
         </w:tc>
@@ -17693,7 +17867,7 @@
                 <w:sz w:val="18"/>
                 <w:szCs w:val="18"/>
               </w:rPr>
-              <w:t xml:space="preserve">Frontend performance</w:t>
+              <w:t xml:space="preserve">Legacy review</w:t>
             </w:r>
           </w:p>
         </w:tc>
@@ -17711,7 +17885,7 @@
                 <w:sz w:val="18"/>
                 <w:szCs w:val="18"/>
               </w:rPr>
-              <w:t xml:space="preserve">Route/chart code splitting or other bundle reduction removes the large-chunk warning without weakening validation.</w:t>
+              <w:t xml:space="preserve">Manually verify retained World Bank/market assets, decide which remain analytically useful, then migrate or delete only with explicit approval.</w:t>
             </w:r>
           </w:p>
         </w:tc>
@@ -17735,65 +17909,6 @@
                 <w:szCs w:val="18"/>
               </w:rPr>
               <w:t xml:space="preserve">6</w:t>
-            </w:r>
-          </w:p>
-        </w:tc>
-        <w:tc>
-          <w:tcPr>
-            <w:tcW w:w="3100" w:type="dxa"/>
-          </w:tcPr>
-          <w:p>
-            <w:pPr>
-              <w:pStyle w:val="TableText"/>
-              <w:keepLines/>
-            </w:pPr>
-            <w:r>
-              <w:rPr>
-                <w:sz w:val="18"/>
-                <w:szCs w:val="18"/>
-              </w:rPr>
-              <w:t xml:space="preserve">Legacy review</w:t>
-            </w:r>
-          </w:p>
-        </w:tc>
-        <w:tc>
-          <w:tcPr>
-            <w:tcW w:w="5000" w:type="dxa"/>
-          </w:tcPr>
-          <w:p>
-            <w:pPr>
-              <w:pStyle w:val="TableText"/>
-              <w:keepLines/>
-            </w:pPr>
-            <w:r>
-              <w:rPr>
-                <w:sz w:val="18"/>
-                <w:szCs w:val="18"/>
-              </w:rPr>
-              <w:t xml:space="preserve">Manually verify retained World Bank/market assets, decide which remain analytically useful, then migrate or delete only with explicit approval.</w:t>
-            </w:r>
-          </w:p>
-        </w:tc>
-      </w:tr>
-      <w:tr>
-        <w:trPr>
-          <w:cantSplit/>
-        </w:trPr>
-        <w:tc>
-          <w:tcPr>
-            <w:tcW w:w="900" w:type="dxa"/>
-          </w:tcPr>
-          <w:p>
-            <w:pPr>
-              <w:pStyle w:val="TableText"/>
-              <w:keepLines/>
-            </w:pPr>
-            <w:r>
-              <w:rPr>
-                <w:sz w:val="18"/>
-                <w:szCs w:val="18"/>
-              </w:rPr>
-              <w:t xml:space="preserve">7</w:t>
             </w:r>
           </w:p>
         </w:tc>
@@ -17893,7 +18008,7 @@
       <w:r>
         <w:t xml:space="preserve">NPCI UPI Product Statistics — Monthly period, banks live, UPI volume (million transactions), and value (₹ crore). Banks live is retained in raw evidence but is not yet a published series.  </w:t>
       </w:r>
-      <w:hyperlink r:id="rId39" w:history="1">
+      <w:hyperlink r:id="rId42" w:history="1">
         <w:r>
           <w:rPr>
             <w:color w:val="0563C1"/>
@@ -17910,7 +18025,7 @@
       <w:r>
         <w:t xml:space="preserve">NPCI structured product-statistics APIs — Product/tab metadata and paginated monthly observations by financial-year range.  </w:t>
       </w:r>
-      <w:hyperlink r:id="rId40" w:history="1">
+      <w:hyperlink r:id="rId43" w:history="1">
         <w:r>
           <w:rPr>
             <w:color w:val="0563C1"/>
@@ -17927,7 +18042,7 @@
       <w:r>
         <w:t xml:space="preserve">World Bank Indicators API — SP.POP.TOTL — Annual India population used as the monthly per-capita denominator.  </w:t>
       </w:r>
-      <w:hyperlink r:id="rId41" w:history="1">
+      <w:hyperlink r:id="rId44" w:history="1">
         <w:r>
           <w:rPr>
             <w:color w:val="0563C1"/>
@@ -17944,7 +18059,7 @@
       <w:r>
         <w:t xml:space="preserve">World Bank Indicators API — NY.GDP.MKTP.CN — Annual nominal GDP in current local currency used for the payment-turnover ratio.  </w:t>
       </w:r>
-      <w:hyperlink r:id="rId42" w:history="1">
+      <w:hyperlink r:id="rId45" w:history="1">
         <w:r>
           <w:rPr>
             <w:color w:val="0563C1"/>
@@ -17959,9 +18074,60 @@
     </w:p>
     <w:p>
       <w:r>
+        <w:t xml:space="preserve">Ministry of Finance / PIB GST history — Fiscal-year gross GST revenue for FY2020–21 through FY2023–24, reported in lakh crore.  </w:t>
+      </w:r>
+      <w:hyperlink r:id="rId46" w:history="1">
+        <w:r>
+          <w:rPr>
+            <w:color w:val="0563C1"/>
+            <w:rStyle w:val="Hyperlink"/>
+          </w:rPr>
+          <w:t xml:space="preserve">https://static.pib.gov.in/WriteReadData/specificdocs/documents/2024/jul/doc202471346101.pdf</w:t>
+        </w:r>
+      </w:hyperlink>
+      <w:r>
+        <w:t xml:space="preserve"/>
+      </w:r>
+    </w:p>
+    <w:p>
+      <w:r>
+        <w:t xml:space="preserve">GST Portal March 2025 collection report — Exact provisional gross GST totals for FY2023–24 and FY2024–25, including CGST, SGST, IGST and cess.  </w:t>
+      </w:r>
+      <w:hyperlink r:id="rId47" w:history="1">
+        <w:r>
+          <w:rPr>
+            <w:color w:val="0563C1"/>
+            <w:rStyle w:val="Hyperlink"/>
+          </w:rPr>
+          <w:t xml:space="preserve">https://tutorial.gst.gov.in/downloads/news/approved_monthly_gst_data_for_publishing_mar_2025.pdf</w:t>
+        </w:r>
+      </w:hyperlink>
+      <w:r>
+        <w:t xml:space="preserve"/>
+      </w:r>
+    </w:p>
+    <w:p>
+      <w:r>
+        <w:t xml:space="preserve">RBI Handbook, Table 1 — Matching fiscal-year nominal GDP at current prices, with RBI/NSO observation status retained.  </w:t>
+      </w:r>
+      <w:hyperlink r:id="rId48" w:history="1">
+        <w:r>
+          <w:rPr>
+            <w:color w:val="0563C1"/>
+            <w:rStyle w:val="Hyperlink"/>
+          </w:rPr>
+          <w:t xml:space="preserve">https://www.rbi.org.in/scripts/PublicationsView.aspx?id=23175</w:t>
+        </w:r>
+      </w:hyperlink>
+      <w:r>
+        <w:t xml:space="preserve"/>
+      </w:r>
+    </w:p>
+    <w:p>
+      <w:r>
         <w:t xml:space="preserve">Union Budget — Budget at a Glance, statement 6 — Across budget editions 2018–19 to 2026–27: actual, original Budget Estimate, Revised Estimate and current Budget Estimate for capital and total expenditure.  </w:t>
       </w:r>
-      <w:hyperlink r:id="rId43" w:history="1">
+      <w:hyperlink r:id="rId49" w:history="1">
         <w:r>
           <w:rPr>
             <w:color w:val="0563C1"/>
@@ -17976,26 +18142,9 @@
     </w:p>
     <w:p>
       <w:r>
-        <w:t xml:space="preserve">RBI Handbook, Table 1: Macro-economic aggregates at current prices — Annual nominal GDP denominators, including the published observation status.  </w:t>
-      </w:r>
-      <w:hyperlink r:id="rId44" w:history="1">
-        <w:r>
-          <w:rPr>
-            <w:color w:val="0563C1"/>
-            <w:rStyle w:val="Hyperlink"/>
-          </w:rPr>
-          <w:t xml:space="preserve">https://www.rbi.org.in/scripts/PublicationsView.aspx?id=23175</w:t>
-        </w:r>
-      </w:hyperlink>
-      <w:r>
-        <w:t xml:space="preserve"/>
-      </w:r>
-    </w:p>
-    <w:p>
-      <w:r>
         <w:t xml:space="preserve">MoSPI new GDP series, base year 2022–23 — Statement 1.1B nominal GDP; Statement 7.1B total GFCF, private non-financial corporation GFCF, and private financial corporation GFCF.  </w:t>
       </w:r>
-      <w:hyperlink r:id="rId45" w:history="1">
+      <w:hyperlink r:id="rId50" w:history="1">
         <w:r>
           <w:rPr>
             <w:color w:val="0563C1"/>
@@ -18012,7 +18161,7 @@
       <w:r>
         <w:t xml:space="preserve">Government-investment processed bundle — Actual central-government CapEx/GDP, shifted one fiscal year forward for visual comparison.  </w:t>
       </w:r>
-      <w:hyperlink r:id="rId46" w:history="1">
+      <w:hyperlink r:id="rId51" w:history="1">
         <w:r>
           <w:rPr>
             <w:color w:val="0563C1"/>
@@ -18027,15 +18176,15 @@
     </w:p>
     <w:p>
       <w:r>
-        <w:t xml:space="preserve">RBI OBICUS — Planned: quarterly aggregate manufacturing capacity utilisation.  </w:t>
-      </w:r>
-      <w:hyperlink r:id="rId47" w:history="1">
+        <w:t xml:space="preserve">RBI OBICUS — Quarterly number of responding companies plus unadjusted and seasonally adjusted aggregate manufacturing capacity utilisation. The published series uses the unadjusted aggregate.  </w:t>
+      </w:r>
+      <w:hyperlink r:id="rId52" w:history="1">
         <w:r>
           <w:rPr>
             <w:color w:val="0563C1"/>
             <w:rStyle w:val="Hyperlink"/>
           </w:rPr>
-          <w:t xml:space="preserve">https://www.rbi.org.in/Scripts/QuarterlyPublications.aspx?head=Order%20Books%2C%20Inventories%20and%20Capacity%20Utilisation%20Survey</w:t>
+          <w:t xml:space="preserve">https://www.rbi.org.in/scripts/PublicationsView.aspx?id=23808</w:t>
         </w:r>
       </w:hyperlink>
       <w:r>
@@ -18046,7 +18195,7 @@
       <w:r>
         <w:t xml:space="preserve">RBI Handbook, Table 239: Select debt indicators — Central liabilities/GDP and adjusted combined Centre-plus-states liabilities/GDP.  </w:t>
       </w:r>
-      <w:hyperlink r:id="rId48" w:history="1">
+      <w:hyperlink r:id="rId53" w:history="1">
         <w:r>
           <w:rPr>
             <w:color w:val="0563C1"/>
@@ -18063,7 +18212,7 @@
       <w:r>
         <w:t xml:space="preserve">RBI Handbook, Table 236: Select fiscal indicators — Gross primary deficit/GDP, revenue receipts/GDP, interest payments/GDP and total expenditure/GDP.  </w:t>
       </w:r>
-      <w:hyperlink r:id="rId49" w:history="1">
+      <w:hyperlink r:id="rId54" w:history="1">
         <w:r>
           <w:rPr>
             <w:color w:val="0563C1"/>
@@ -18080,7 +18229,7 @@
       <w:r>
         <w:t xml:space="preserve">RBI Handbook, Table 206: 40-currency NEER/REER — Monthly trade-weighted REER index, 2015–16=100.  </w:t>
       </w:r>
-      <w:hyperlink r:id="rId50" w:history="1">
+      <w:hyperlink r:id="rId55" w:history="1">
         <w:r>
           <w:rPr>
             <w:color w:val="0563C1"/>
@@ -18097,7 +18246,7 @@
       <w:r>
         <w:t xml:space="preserve">RBI Handbook, Table 192: Oil and non-oil trade — Monthly non-oil exports in US dollars.  </w:t>
       </w:r>
-      <w:hyperlink r:id="rId51" w:history="1">
+      <w:hyperlink r:id="rId56" w:history="1">
         <w:r>
           <w:rPr>
             <w:color w:val="0563C1"/>
@@ -18114,7 +18263,7 @@
       <w:r>
         <w:t xml:space="preserve">RBI Handbook, Table 195: Balance of payments — Quarterly merchandise net and invisibles net, in ₹ crore, used to construct the current account.  </w:t>
       </w:r>
-      <w:hyperlink r:id="rId52" w:history="1">
+      <w:hyperlink r:id="rId57" w:history="1">
         <w:r>
           <w:rPr>
             <w:color w:val="0563C1"/>
@@ -18131,7 +18280,7 @@
       <w:r>
         <w:t xml:space="preserve">RBI Handbook, Table 155: Quarterly GDP — Quarterly nominal GDP at current prices in ₹ crore.  </w:t>
       </w:r>
-      <w:hyperlink r:id="rId53" w:history="1">
+      <w:hyperlink r:id="rId58" w:history="1">
         <w:r>
           <w:rPr>
             <w:color w:val="0563C1"/>
@@ -18148,7 +18297,7 @@
       <w:r>
         <w:t xml:space="preserve">AISHE Final Report 2023–24, Table 47 — All-India, all-category, both-sex Gross Enrolment Ratio for ages 18–23.  </w:t>
       </w:r>
-      <w:hyperlink r:id="rId54" w:history="1">
+      <w:hyperlink r:id="rId59" w:history="1">
         <w:r>
           <w:rPr>
             <w:color w:val="0563C1"/>
@@ -18165,7 +18314,7 @@
       <w:r>
         <w:t xml:space="preserve">PLFS Annual Report 2025, Statements 7 and 17 — Rural-plus-urban persons aged 15+, usual status (ps+ss): secondary-and-above unemployment rate and regular wage/salaried share among workers.  </w:t>
       </w:r>
-      <w:hyperlink r:id="rId55" w:history="1">
+      <w:hyperlink r:id="rId60" w:history="1">
         <w:r>
           <w:rPr>
             <w:color w:val="0563C1"/>
@@ -18182,7 +18331,7 @@
       <w:r>
         <w:t xml:space="preserve">NSE FII/FPI &amp; DII trading activity report — Current trading date; DII and FII/FPI gross purchases, gross sales and net activity in ₹ crore.  </w:t>
       </w:r>
-      <w:hyperlink r:id="rId56" w:history="1">
+      <w:hyperlink r:id="rId61" w:history="1">
         <w:r>
           <w:rPr>
             <w:color w:val="0563C1"/>
@@ -18199,7 +18348,7 @@
       <w:r>
         <w:t xml:space="preserve">NSE report API — Structured current-day provisional observations used after establishing the NSE web session.  </w:t>
       </w:r>
-      <w:hyperlink r:id="rId57" w:history="1">
+      <w:hyperlink r:id="rId62" w:history="1">
         <w:r>
           <w:rPr>
             <w:color w:val="0563C1"/>
@@ -18237,9 +18386,9 @@
     </w:p>
     <w:p>
       <w:r>
-        <w:t xml:space="preserve">2026-07-21T16:06:02.132526+00:00  ·  </w:t>
-      </w:r>
-      <w:hyperlink r:id="rId58" w:history="1">
+        <w:t xml:space="preserve">2026-07-22T14:56:01.113364+00:00  ·  </w:t>
+      </w:r>
+      <w:hyperlink r:id="rId63" w:history="1">
         <w:r>
           <w:rPr>
             <w:color w:val="0563C1"/>
@@ -18258,6 +18407,45 @@
       </w:r>
     </w:p>
     <w:p>
+      <w:r>
+        <w:t xml:space="preserve">2026-07-22T14:56:01.485083+00:00  ·  </w:t>
+      </w:r>
+      <w:hyperlink r:id="rId64" w:history="1">
+        <w:r>
+          <w:rPr>
+            <w:color w:val="0563C1"/>
+            <w:rStyle w:val="Hyperlink"/>
+          </w:rPr>
+          <w:t xml:space="preserve">pib-gst-history</w:t>
+        </w:r>
+      </w:hyperlink>
+      <w:r>
+        <w:t xml:space="preserve"/>
+      </w:r>
+    </w:p>
+    <w:p>
+      <w:r>
+        <w:t xml:space="preserve">2026-07-22T14:56:06.152621+00:00  ·  </w:t>
+      </w:r>
+      <w:hyperlink r:id="rId65" w:history="1">
+        <w:r>
+          <w:rPr>
+            <w:color w:val="0563C1"/>
+            <w:rStyle w:val="Hyperlink"/>
+          </w:rPr>
+          <w:t xml:space="preserve">gst-march-2025</w:t>
+        </w:r>
+      </w:hyperlink>
+      <w:r>
+        <w:t xml:space="preserve"/>
+      </w:r>
+    </w:p>
+    <w:p>
+      <w:r>
+        <w:t xml:space="preserve">retrieval time inherited from validated upstream artifact  ·  RBI Handbook Table 1 (NSO nominal GDP)</w:t>
+      </w:r>
+    </w:p>
+    <w:p>
       <w:pPr>
         <w:pStyle w:val="Heading3"/>
         <w:keepNext/>
@@ -18270,7 +18458,7 @@
       <w:r>
         <w:t xml:space="preserve">2026-07-21T16:34:34.249236+00:00  ·  </w:t>
       </w:r>
-      <w:hyperlink r:id="rId59" w:history="1">
+      <w:hyperlink r:id="rId66" w:history="1">
         <w:r>
           <w:rPr>
             <w:color w:val="0563C1"/>
@@ -18287,7 +18475,7 @@
       <w:r>
         <w:t xml:space="preserve">2026-07-21T16:34:35.071323+00:00  ·  </w:t>
       </w:r>
-      <w:hyperlink r:id="rId60" w:history="1">
+      <w:hyperlink r:id="rId67" w:history="1">
         <w:r>
           <w:rPr>
             <w:color w:val="0563C1"/>
@@ -18304,7 +18492,7 @@
       <w:r>
         <w:t xml:space="preserve">2026-07-21T16:34:35.692956+00:00  ·  </w:t>
       </w:r>
-      <w:hyperlink r:id="rId61" w:history="1">
+      <w:hyperlink r:id="rId68" w:history="1">
         <w:r>
           <w:rPr>
             <w:color w:val="0563C1"/>
@@ -18321,7 +18509,7 @@
       <w:r>
         <w:t xml:space="preserve">2026-07-21T16:34:36.495290+00:00  ·  </w:t>
       </w:r>
-      <w:hyperlink r:id="rId62" w:history="1">
+      <w:hyperlink r:id="rId69" w:history="1">
         <w:r>
           <w:rPr>
             <w:color w:val="0563C1"/>
@@ -18338,7 +18526,7 @@
       <w:r>
         <w:t xml:space="preserve">2026-07-21T16:34:36.316922+00:00  ·  </w:t>
       </w:r>
-      <w:hyperlink r:id="rId63" w:history="1">
+      <w:hyperlink r:id="rId70" w:history="1">
         <w:r>
           <w:rPr>
             <w:color w:val="0563C1"/>
@@ -18355,7 +18543,7 @@
       <w:r>
         <w:t xml:space="preserve">2026-07-21T16:34:36.122099+00:00  ·  </w:t>
       </w:r>
-      <w:hyperlink r:id="rId64" w:history="1">
+      <w:hyperlink r:id="rId71" w:history="1">
         <w:r>
           <w:rPr>
             <w:color w:val="0563C1"/>
@@ -18372,7 +18560,7 @@
       <w:r>
         <w:t xml:space="preserve">2026-07-21T16:34:36.693453+00:00  ·  </w:t>
       </w:r>
-      <w:hyperlink r:id="rId65" w:history="1">
+      <w:hyperlink r:id="rId72" w:history="1">
         <w:r>
           <w:rPr>
             <w:color w:val="0563C1"/>
@@ -18389,7 +18577,7 @@
       <w:r>
         <w:t xml:space="preserve">2026-07-21T16:34:37.270457+00:00  ·  </w:t>
       </w:r>
-      <w:hyperlink r:id="rId66" w:history="1">
+      <w:hyperlink r:id="rId73" w:history="1">
         <w:r>
           <w:rPr>
             <w:color w:val="0563C1"/>
@@ -18406,7 +18594,7 @@
       <w:r>
         <w:t xml:space="preserve">2026-07-21T16:34:37.491668+00:00  ·  </w:t>
       </w:r>
-      <w:hyperlink r:id="rId67" w:history="1">
+      <w:hyperlink r:id="rId74" w:history="1">
         <w:r>
           <w:rPr>
             <w:color w:val="0563C1"/>
@@ -18423,7 +18611,7 @@
       <w:r>
         <w:t xml:space="preserve">2026-07-21T16:34:39.521267+00:00  ·  </w:t>
       </w:r>
-      <w:hyperlink r:id="rId68" w:history="1">
+      <w:hyperlink r:id="rId75" w:history="1">
         <w:r>
           <w:rPr>
             <w:color w:val="0563C1"/>
@@ -18447,9 +18635,9 @@
     </w:p>
     <w:p>
       <w:r>
-        <w:t xml:space="preserve">2026-07-21T16:42:09.665369+00:00  ·  </w:t>
-      </w:r>
-      <w:hyperlink r:id="rId69" w:history="1">
+        <w:t xml:space="preserve">2026-07-22T14:55:22.148111+00:00  ·  </w:t>
+      </w:r>
+      <w:hyperlink r:id="rId76" w:history="1">
         <w:r>
           <w:rPr>
             <w:color w:val="0563C1"/>
@@ -18468,6 +18656,23 @@
       </w:r>
     </w:p>
     <w:p>
+      <w:r>
+        <w:t xml:space="preserve">2026-07-22T14:55:24.649965+00:00  ·  </w:t>
+      </w:r>
+      <w:hyperlink r:id="rId77" w:history="1">
+        <w:r>
+          <w:rPr>
+            <w:color w:val="0563C1"/>
+            <w:rStyle w:val="Hyperlink"/>
+          </w:rPr>
+          <w:t xml:space="preserve">RBI OBICUS — Table 1 Capacity Utilisation</w:t>
+        </w:r>
+      </w:hyperlink>
+      <w:r>
+        <w:t xml:space="preserve"/>
+      </w:r>
+    </w:p>
+    <w:p>
       <w:pPr>
         <w:pStyle w:val="Heading3"/>
         <w:keepNext/>
@@ -18480,7 +18685,7 @@
       <w:r>
         <w:t xml:space="preserve">2026-07-21T16:32:40.149539+00:00  ·  </w:t>
       </w:r>
-      <w:hyperlink r:id="rId70" w:history="1">
+      <w:hyperlink r:id="rId78" w:history="1">
         <w:r>
           <w:rPr>
             <w:color w:val="0563C1"/>
@@ -18497,7 +18702,7 @@
       <w:r>
         <w:t xml:space="preserve">2026-07-21T16:32:41.747009+00:00  ·  </w:t>
       </w:r>
-      <w:hyperlink r:id="rId71" w:history="1">
+      <w:hyperlink r:id="rId79" w:history="1">
         <w:r>
           <w:rPr>
             <w:color w:val="0563C1"/>
@@ -18523,7 +18728,7 @@
       <w:r>
         <w:t xml:space="preserve">2026-07-21T16:30:26.796425+00:00  ·  </w:t>
       </w:r>
-      <w:hyperlink r:id="rId72" w:history="1">
+      <w:hyperlink r:id="rId80" w:history="1">
         <w:r>
           <w:rPr>
             <w:color w:val="0563C1"/>
@@ -18540,7 +18745,7 @@
       <w:r>
         <w:t xml:space="preserve">2026-07-21T16:30:28.743826+00:00  ·  </w:t>
       </w:r>
-      <w:hyperlink r:id="rId73" w:history="1">
+      <w:hyperlink r:id="rId81" w:history="1">
         <w:r>
           <w:rPr>
             <w:color w:val="0563C1"/>
@@ -18557,7 +18762,7 @@
       <w:r>
         <w:t xml:space="preserve">2026-07-21T16:30:30.790855+00:00  ·  </w:t>
       </w:r>
-      <w:hyperlink r:id="rId74" w:history="1">
+      <w:hyperlink r:id="rId82" w:history="1">
         <w:r>
           <w:rPr>
             <w:color w:val="0563C1"/>
@@ -18574,7 +18779,7 @@
       <w:r>
         <w:t xml:space="preserve">2026-07-21T16:30:31.666147+00:00  ·  </w:t>
       </w:r>
-      <w:hyperlink r:id="rId75" w:history="1">
+      <w:hyperlink r:id="rId83" w:history="1">
         <w:r>
           <w:rPr>
             <w:color w:val="0563C1"/>
@@ -18600,7 +18805,7 @@
       <w:r>
         <w:t xml:space="preserve">2026-07-21T16:54:06.769848+00:00  ·  </w:t>
       </w:r>
-      <w:hyperlink r:id="rId76" w:history="1">
+      <w:hyperlink r:id="rId84" w:history="1">
         <w:r>
           <w:rPr>
             <w:color w:val="0563C1"/>
@@ -18617,7 +18822,7 @@
       <w:r>
         <w:t xml:space="preserve">2026-07-21T16:55:15.430806+00:00  ·  </w:t>
       </w:r>
-      <w:hyperlink r:id="rId77" w:history="1">
+      <w:hyperlink r:id="rId85" w:history="1">
         <w:r>
           <w:rPr>
             <w:color w:val="0563C1"/>
@@ -18641,9 +18846,9 @@
     </w:p>
     <w:p>
       <w:r>
-        <w:t xml:space="preserve">2026-07-21T16:57:05.619863+00:00  ·  </w:t>
-      </w:r>
-      <w:hyperlink r:id="rId78" w:history="1">
+        <w:t xml:space="preserve">2026-07-22T14:56:51.190783+00:00  ·  </w:t>
+      </w:r>
+      <w:hyperlink r:id="rId86" w:history="1">
         <w:r>
           <w:rPr>
             <w:color w:val="0563C1"/>

</xml_diff>

<commit_message>
Refined scope to specifically CapEx story - reviewed correlations between specific metrics and updated to frontend
</commit_message>
<xml_diff>
--- a/docs/architecture/FOCUSED_PIPELINE_ARCHITECTURE.docx
+++ b/docs/architecture/FOCUSED_PIPELINE_ARCHITECTURE.docx
@@ -156,7 +156,7 @@
                 <w:sz w:val="18"/>
                 <w:szCs w:val="18"/>
               </w:rPr>
-              <w:t xml:space="preserve">1.0</w:t>
+              <w:t xml:space="preserve">1.2</w:t>
             </w:r>
           </w:p>
         </w:tc>
@@ -197,7 +197,7 @@
                 <w:sz w:val="18"/>
                 <w:szCs w:val="18"/>
               </w:rPr>
-              <w:t xml:space="preserve">22 July 2026</w:t>
+              <w:t xml:space="preserve">28 July 2026</w:t>
             </w:r>
           </w:p>
         </w:tc>
@@ -279,7 +279,7 @@
                 <w:sz w:val="18"/>
                 <w:szCs w:val="18"/>
               </w:rPr>
-              <w:t xml:space="preserve">Seven focused research lenses plus retained legacy compatibility</w:t>
+              <w:t xml:space="preserve">Seven focused research lenses, registered evidence foundations and retained legacy compatibility</w:t>
             </w:r>
           </w:p>
         </w:tc>
@@ -607,6 +607,11 @@
       </w:r>
     </w:p>
     <w:p>
+      <w:r>
+        <w:t xml:space="preserve">A separate evidence layer now estimates and publishes two fiscal analyses and one UPI trend analysis under versioned specifications. Registered loaders, time-aware alignment and deterministic eligibility gates feed OLS models with Newey–West HAC uncertainty, predeclared diagnostics, robustness checks, Benjamini–Hochberg adjustment and deterministic grading. Source-artifact SHA-256 digests and required code/software versions make each report traceable to its exact inputs.</w:t>
+      </w:r>
+    </w:p>
+    <w:p>
       <w:pPr>
         <w:keepLines/>
         <w:spacing w:before="120" w:after="160"/>
@@ -625,6 +630,27 @@
       </w:r>
       <w:r>
         <w:t xml:space="preserve">The project distinguishes a reported statistic, a derived statistic and an interpretation. A formula can make two inputs comparable; it cannot by itself establish causality, welfare effects, project quality or fair value.</w:t>
+      </w:r>
+    </w:p>
+    <w:p>
+      <w:pPr>
+        <w:keepLines/>
+        <w:spacing w:before="120" w:after="160"/>
+        <w:ind w:left="180"/>
+        <w:pBdr>
+          <w:left w:val="single" w:sz="18" w:space="10" w:color="2E7D6B"/>
+        </w:pBdr>
+        <w:shd w:val="clear" w:color="auto" w:fill="ECFDF5"/>
+      </w:pPr>
+      <w:r>
+        <w:rPr>
+          <w:b/>
+          <w:color w:val="2E7D6B"/>
+        </w:rPr>
+        <w:t xml:space="preserve">Evidence milestone  </w:t>
+      </w:r>
+      <w:r>
+        <w:t xml:space="preserve">Specification registry 1.2.0, estimation, the evidence-report schema, cross-field validation, atomic export and validated promotion are complete for fiscal capacity and digital integration. Eligibility counts still describe readiness; coefficients and grades appear only in the separate evidence reports.</w:t>
       </w:r>
     </w:p>
     <w:tbl>
@@ -1751,6 +1777,47 @@
           </w:p>
         </w:tc>
       </w:tr>
+      <w:tr>
+        <w:trPr>
+          <w:cantSplit/>
+        </w:trPr>
+        <w:tc>
+          <w:tcPr>
+            <w:tcW w:w="2200" w:type="dxa"/>
+          </w:tcPr>
+          <w:p>
+            <w:pPr>
+              <w:pStyle w:val="TableText"/>
+              <w:keepLines/>
+            </w:pPr>
+            <w:r>
+              <w:rPr>
+                <w:sz w:val="18"/>
+                <w:szCs w:val="18"/>
+              </w:rPr>
+              <w:t xml:space="preserve">Specify before estimation</w:t>
+            </w:r>
+          </w:p>
+        </w:tc>
+        <w:tc>
+          <w:tcPr>
+            <w:tcW w:w="6800" w:type="dxa"/>
+          </w:tcPr>
+          <w:p>
+            <w:pPr>
+              <w:pStyle w:val="TableText"/>
+              <w:keepLines/>
+            </w:pPr>
+            <w:r>
+              <w:rPr>
+                <w:sz w:val="18"/>
+                <w:szCs w:val="18"/>
+              </w:rPr>
+              <w:t xml:space="preserve">Evidence questions, transformations, lag rules, exceptional periods, uncertainty estimators and robustness checks are versioned before results are calculated.</w:t>
+            </w:r>
+          </w:p>
+        </w:tc>
+      </w:tr>
     </w:tbl>
     <w:p>
       <w:pPr>
@@ -2139,6 +2206,65 @@
                 <w:sz w:val="18"/>
                 <w:szCs w:val="18"/>
               </w:rPr>
+              <w:t xml:space="preserve">scripts/analysis/</w:t>
+            </w:r>
+          </w:p>
+        </w:tc>
+        <w:tc>
+          <w:tcPr>
+            <w:tcW w:w="4000" w:type="dxa"/>
+          </w:tcPr>
+          <w:p>
+            <w:pPr>
+              <w:pStyle w:val="TableText"/>
+              <w:keepLines/>
+            </w:pPr>
+            <w:r>
+              <w:rPr>
+                <w:sz w:val="18"/>
+                <w:szCs w:val="18"/>
+              </w:rPr>
+              <w:t xml:space="preserve">Registered artifact loading, status-aware alignment and pre-estimation eligibility</w:t>
+            </w:r>
+          </w:p>
+        </w:tc>
+        <w:tc>
+          <w:tcPr>
+            <w:tcW w:w="2800" w:type="dxa"/>
+          </w:tcPr>
+          <w:p>
+            <w:pPr>
+              <w:pStyle w:val="TableText"/>
+              <w:keepLines/>
+            </w:pPr>
+            <w:r>
+              <w:rPr>
+                <w:sz w:val="18"/>
+                <w:szCs w:val="18"/>
+              </w:rPr>
+              <w:t xml:space="preserve">No unregistered series or future-period values enter a sample</w:t>
+            </w:r>
+          </w:p>
+        </w:tc>
+      </w:tr>
+      <w:tr>
+        <w:trPr>
+          <w:cantSplit/>
+        </w:trPr>
+        <w:tc>
+          <w:tcPr>
+            <w:tcW w:w="2200" w:type="dxa"/>
+          </w:tcPr>
+          <w:p>
+            <w:pPr>
+              <w:pStyle w:val="TableText"/>
+              <w:keepLines/>
+            </w:pPr>
+            <w:r>
+              <w:rPr>
+                <w:sz w:val="18"/>
+                <w:szCs w:val="18"/>
+              </w:rPr>
               <w:t xml:space="preserve">scripts/build_*.py</w:t>
             </w:r>
           </w:p>
@@ -2353,6 +2479,65 @@
                 <w:szCs w:val="18"/>
               </w:rPr>
               <w:t xml:space="preserve">Payload shape is versionable and testable</w:t>
+            </w:r>
+          </w:p>
+        </w:tc>
+      </w:tr>
+      <w:tr>
+        <w:trPr>
+          <w:cantSplit/>
+        </w:trPr>
+        <w:tc>
+          <w:tcPr>
+            <w:tcW w:w="2200" w:type="dxa"/>
+          </w:tcPr>
+          <w:p>
+            <w:pPr>
+              <w:pStyle w:val="TableText"/>
+              <w:keepLines/>
+            </w:pPr>
+            <w:r>
+              <w:rPr>
+                <w:sz w:val="18"/>
+                <w:szCs w:val="18"/>
+              </w:rPr>
+              <w:t xml:space="preserve">docs/decisions/</w:t>
+            </w:r>
+          </w:p>
+        </w:tc>
+        <w:tc>
+          <w:tcPr>
+            <w:tcW w:w="4000" w:type="dxa"/>
+          </w:tcPr>
+          <w:p>
+            <w:pPr>
+              <w:pStyle w:val="TableText"/>
+              <w:keepLines/>
+            </w:pPr>
+            <w:r>
+              <w:rPr>
+                <w:sz w:val="18"/>
+                <w:szCs w:val="18"/>
+              </w:rPr>
+              <w:t xml:space="preserve">Versioned analytical-policy decisions</w:t>
+            </w:r>
+          </w:p>
+        </w:tc>
+        <w:tc>
+          <w:tcPr>
+            <w:tcW w:w="2800" w:type="dxa"/>
+          </w:tcPr>
+          <w:p>
+            <w:pPr>
+              <w:pStyle w:val="TableText"/>
+              <w:keepLines/>
+            </w:pPr>
+            <w:r>
+              <w:rPr>
+                <w:sz w:val="18"/>
+                <w:szCs w:val="18"/>
+              </w:rPr>
+              <w:t xml:space="preserve">Post-result changes require a new recorded specification version</w:t>
             </w:r>
           </w:p>
         </w:tc>
@@ -3495,6 +3680,34 @@
         <w:keepNext/>
       </w:pPr>
       <w:r>
+        <w:t xml:space="preserve">Registered evidence branch</w:t>
+      </w:r>
+    </w:p>
+    <w:p>
+      <w:r>
+        <w:t xml:space="preserve">Evidence production consumes validated processed bundles; it does not bypass the source-to-publication path above. The implemented branch is:</w:t>
+      </w:r>
+    </w:p>
+    <w:p>
+      <w:pPr>
+        <w:pStyle w:val="Code"/>
+        <w:keepLines/>
+      </w:pPr>
+      <w:r>
+        <w:t xml:space="preserve">Frozen evidence specification → registered processed-artifact loader → status filtering → transformations and lagging → explicit date alignment → exclusions ledger → eligibility gates → frozen design matrix → OLS + HAC inference → diagnostics + robustness → family adjustment + grading → evidence-report validation → atomic publication</w:t>
+      </w:r>
+    </w:p>
+    <w:p>
+      <w:r>
+        <w:t xml:space="preserve">Only an eligible prepared sample reaches estimation. Failed gates become a structured insufficient-data result rather than a best-effort regression. Eligible samples pass through the frozen design, HAC inference, diagnostics, robustness, family adjustment and grading; every completed report then passes the evidence-report schema and semantic validator before atomic export and promotion.</w:t>
+      </w:r>
+    </w:p>
+    <w:p>
+      <w:pPr>
+        <w:pStyle w:val="Heading2"/>
+        <w:keepNext/>
+      </w:pPr>
+      <w:r>
         <w:t xml:space="preserve">Acquisition patterns by source type</w:t>
       </w:r>
     </w:p>
@@ -4592,6 +4805,65 @@
           </w:p>
         </w:tc>
       </w:tr>
+      <w:tr>
+        <w:trPr>
+          <w:cantSplit/>
+        </w:trPr>
+        <w:tc>
+          <w:tcPr>
+            <w:tcW w:w="2100" w:type="dxa"/>
+          </w:tcPr>
+          <w:p>
+            <w:pPr>
+              <w:pStyle w:val="TableText"/>
+              <w:keepLines/>
+            </w:pPr>
+            <w:r>
+              <w:rPr>
+                <w:sz w:val="18"/>
+                <w:szCs w:val="18"/>
+              </w:rPr>
+              <w:t xml:space="preserve">evidence_report</w:t>
+            </w:r>
+          </w:p>
+        </w:tc>
+        <w:tc>
+          <w:tcPr>
+            <w:tcW w:w="4800" w:type="dxa"/>
+          </w:tcPr>
+          <w:p>
+            <w:pPr>
+              <w:pStyle w:val="TableText"/>
+              <w:keepLines/>
+            </w:pPr>
+            <w:r>
+              <w:rPr>
+                <w:sz w:val="18"/>
+                <w:szCs w:val="18"/>
+              </w:rPr>
+              <w:t xml:space="preserve">Versioned lens-level analyses, source digests, code/software versions, sample/exclusion metadata, estimates, diagnostics, robustness, eligibility and limitations. Fiscal-capacity and digital-integration reports are published.</w:t>
+            </w:r>
+          </w:p>
+        </w:tc>
+        <w:tc>
+          <w:tcPr>
+            <w:tcW w:w="2100" w:type="dxa"/>
+          </w:tcPr>
+          <w:p>
+            <w:pPr>
+              <w:pStyle w:val="TableText"/>
+              <w:keepLines/>
+            </w:pPr>
+            <w:r>
+              <w:rPr>
+                <w:sz w:val="18"/>
+                <w:szCs w:val="18"/>
+              </w:rPr>
+              <w:t xml:space="preserve">EvidencePanel renders the lens-level contract without a chart adapter</w:t>
+            </w:r>
+          </w:p>
+        </w:tc>
+      </w:tr>
     </w:tbl>
     <w:p>
       <w:pPr>
@@ -4599,6 +4871,916 @@
       </w:pPr>
       <w:r>
         <w:t xml:space="preserve"/>
+      </w:r>
+    </w:p>
+    <w:p>
+      <w:pPr>
+        <w:pStyle w:val="Heading2"/>
+        <w:keepNext/>
+      </w:pPr>
+      <w:r>
+        <w:t xml:space="preserve">Evidence specifications and current pre-estimation readiness</w:t>
+      </w:r>
+    </w:p>
+    <w:p>
+      <w:r>
+        <w:t xml:space="preserve">The table below is generated by loading the current processed artifacts through the registered alignment and eligibility pipeline. Passing means only that a model may be attempted under the frozen specification; it says nothing about coefficient direction, uncertainty or robustness.</w:t>
+      </w:r>
+    </w:p>
+    <w:tbl>
+      <w:tblPr>
+        <w:tblStyle w:val="ArchitectureTable"/>
+        <w:tblW w:w="0" w:type="auto"/>
+        <w:tblLayout w:type="fixed"/>
+        <w:tblLook w:val="04A0" w:firstRow="1" w:lastRow="0" w:firstColumn="0" w:lastColumn="0" w:noHBand="0" w:noVBand="1"/>
+      </w:tblPr>
+      <w:tblGrid>
+        <w:gridCol w:w="1900"/>
+        <w:gridCol w:w="3100"/>
+        <w:gridCol w:w="1700"/>
+        <w:gridCol w:w="1400"/>
+        <w:gridCol w:w="900"/>
+      </w:tblGrid>
+      <w:tr>
+        <w:trPr>
+          <w:tblHeader/>
+          <w:cantSplit/>
+        </w:trPr>
+        <w:tc>
+          <w:tcPr>
+            <w:tcW w:w="1900" w:type="dxa"/>
+            <w:shd w:val="clear" w:color="auto" w:fill="1F4E78"/>
+          </w:tcPr>
+          <w:p>
+            <w:pPr>
+              <w:pStyle w:val="TableText"/>
+              <w:keepLines/>
+            </w:pPr>
+            <w:r>
+              <w:rPr>
+                <w:b/>
+                <w:color w:val="FFFFFF"/>
+                <w:sz w:val="15"/>
+                <w:szCs w:val="15"/>
+              </w:rPr>
+              <w:t xml:space="preserve">Registered analysis</w:t>
+            </w:r>
+          </w:p>
+        </w:tc>
+        <w:tc>
+          <w:tcPr>
+            <w:tcW w:w="3100" w:type="dxa"/>
+            <w:shd w:val="clear" w:color="auto" w:fill="1F4E78"/>
+          </w:tcPr>
+          <w:p>
+            <w:pPr>
+              <w:pStyle w:val="TableText"/>
+              <w:keepLines/>
+            </w:pPr>
+            <w:r>
+              <w:rPr>
+                <w:b/>
+                <w:color w:val="FFFFFF"/>
+                <w:sz w:val="15"/>
+                <w:szCs w:val="15"/>
+              </w:rPr>
+              <w:t xml:space="preserve">Frozen model</w:t>
+            </w:r>
+          </w:p>
+        </w:tc>
+        <w:tc>
+          <w:tcPr>
+            <w:tcW w:w="1700" w:type="dxa"/>
+            <w:shd w:val="clear" w:color="auto" w:fill="1F4E78"/>
+          </w:tcPr>
+          <w:p>
+            <w:pPr>
+              <w:pStyle w:val="TableText"/>
+              <w:keepLines/>
+            </w:pPr>
+            <w:r>
+              <w:rPr>
+                <w:b/>
+                <w:color w:val="FFFFFF"/>
+                <w:sz w:val="15"/>
+                <w:szCs w:val="15"/>
+              </w:rPr>
+              <w:t xml:space="preserve">Aligned coverage</w:t>
+            </w:r>
+          </w:p>
+        </w:tc>
+        <w:tc>
+          <w:tcPr>
+            <w:tcW w:w="1400" w:type="dxa"/>
+            <w:shd w:val="clear" w:color="auto" w:fill="1F4E78"/>
+          </w:tcPr>
+          <w:p>
+            <w:pPr>
+              <w:pStyle w:val="TableText"/>
+              <w:keepLines/>
+            </w:pPr>
+            <w:r>
+              <w:rPr>
+                <w:b/>
+                <w:color w:val="FFFFFF"/>
+                <w:sz w:val="15"/>
+                <w:szCs w:val="15"/>
+              </w:rPr>
+              <w:t xml:space="preserve">Available / required</w:t>
+            </w:r>
+          </w:p>
+        </w:tc>
+        <w:tc>
+          <w:tcPr>
+            <w:tcW w:w="900" w:type="dxa"/>
+            <w:shd w:val="clear" w:color="auto" w:fill="1F4E78"/>
+          </w:tcPr>
+          <w:p>
+            <w:pPr>
+              <w:pStyle w:val="TableText"/>
+              <w:keepLines/>
+            </w:pPr>
+            <w:r>
+              <w:rPr>
+                <w:b/>
+                <w:color w:val="FFFFFF"/>
+                <w:sz w:val="15"/>
+                <w:szCs w:val="15"/>
+              </w:rPr>
+              <w:t xml:space="preserve">Gate</w:t>
+            </w:r>
+          </w:p>
+        </w:tc>
+      </w:tr>
+      <w:tr>
+        <w:trPr>
+          <w:cantSplit/>
+        </w:trPr>
+        <w:tc>
+          <w:tcPr>
+            <w:tcW w:w="1900" w:type="dxa"/>
+          </w:tcPr>
+          <w:p>
+            <w:pPr>
+              <w:pStyle w:val="TableText"/>
+              <w:keepLines/>
+            </w:pPr>
+            <w:r>
+              <w:rPr>
+                <w:sz w:val="15"/>
+                <w:szCs w:val="15"/>
+              </w:rPr>
+              <w:t xml:space="preserve">Lagged debt and change in interest burden</w:t>
+            </w:r>
+          </w:p>
+        </w:tc>
+        <w:tc>
+          <w:tcPr>
+            <w:tcW w:w="3100" w:type="dxa"/>
+          </w:tcPr>
+          <w:p>
+            <w:pPr>
+              <w:pStyle w:val="TableText"/>
+              <w:keepLines/>
+            </w:pPr>
+            <w:r>
+              <w:rPr>
+                <w:sz w:val="15"/>
+                <w:szCs w:val="15"/>
+              </w:rPr>
+              <w:t xml:space="preserve">delta_interest_burden ~ lagged_general_government_debt + lagged_primary_balance + trend</w:t>
+            </w:r>
+          </w:p>
+        </w:tc>
+        <w:tc>
+          <w:tcPr>
+            <w:tcW w:w="1700" w:type="dxa"/>
+          </w:tcPr>
+          <w:p>
+            <w:pPr>
+              <w:pStyle w:val="TableText"/>
+              <w:keepLines/>
+            </w:pPr>
+            <w:r>
+              <w:rPr>
+                <w:sz w:val="15"/>
+                <w:szCs w:val="15"/>
+              </w:rPr>
+              <w:t xml:space="preserve">1986-03-31 → 2025-03-31</w:t>
+            </w:r>
+          </w:p>
+        </w:tc>
+        <w:tc>
+          <w:tcPr>
+            <w:tcW w:w="1400" w:type="dxa"/>
+          </w:tcPr>
+          <w:p>
+            <w:pPr>
+              <w:pStyle w:val="TableText"/>
+              <w:keepLines/>
+            </w:pPr>
+            <w:r>
+              <w:rPr>
+                <w:sz w:val="15"/>
+                <w:szCs w:val="15"/>
+              </w:rPr>
+              <w:t xml:space="preserve">40 / 30</w:t>
+            </w:r>
+          </w:p>
+        </w:tc>
+        <w:tc>
+          <w:tcPr>
+            <w:tcW w:w="900" w:type="dxa"/>
+          </w:tcPr>
+          <w:p>
+            <w:pPr>
+              <w:pStyle w:val="TableText"/>
+              <w:keepLines/>
+            </w:pPr>
+            <w:r>
+              <w:rPr>
+                <w:sz w:val="15"/>
+                <w:szCs w:val="15"/>
+              </w:rPr>
+              <w:t xml:space="preserve">PASS</w:t>
+            </w:r>
+          </w:p>
+        </w:tc>
+      </w:tr>
+      <w:tr>
+        <w:trPr>
+          <w:cantSplit/>
+        </w:trPr>
+        <w:tc>
+          <w:tcPr>
+            <w:tcW w:w="1900" w:type="dxa"/>
+          </w:tcPr>
+          <w:p>
+            <w:pPr>
+              <w:pStyle w:val="TableText"/>
+              <w:keepLines/>
+            </w:pPr>
+            <w:r>
+              <w:rPr>
+                <w:sz w:val="15"/>
+                <w:szCs w:val="15"/>
+              </w:rPr>
+              <w:t xml:space="preserve">Primary balance and subsequent debt movement</w:t>
+            </w:r>
+          </w:p>
+        </w:tc>
+        <w:tc>
+          <w:tcPr>
+            <w:tcW w:w="3100" w:type="dxa"/>
+          </w:tcPr>
+          <w:p>
+            <w:pPr>
+              <w:pStyle w:val="TableText"/>
+              <w:keepLines/>
+            </w:pPr>
+            <w:r>
+              <w:rPr>
+                <w:sz w:val="15"/>
+                <w:szCs w:val="15"/>
+              </w:rPr>
+              <w:t xml:space="preserve">debt_change ~ lagged_primary_balance + lagged_debt_change + covid_fy2020_22</w:t>
+            </w:r>
+          </w:p>
+        </w:tc>
+        <w:tc>
+          <w:tcPr>
+            <w:tcW w:w="1700" w:type="dxa"/>
+          </w:tcPr>
+          <w:p>
+            <w:pPr>
+              <w:pStyle w:val="TableText"/>
+              <w:keepLines/>
+            </w:pPr>
+            <w:r>
+              <w:rPr>
+                <w:sz w:val="15"/>
+                <w:szCs w:val="15"/>
+              </w:rPr>
+              <w:t xml:space="preserve">1987-03-31 → 2024-03-31</w:t>
+            </w:r>
+          </w:p>
+        </w:tc>
+        <w:tc>
+          <w:tcPr>
+            <w:tcW w:w="1400" w:type="dxa"/>
+          </w:tcPr>
+          <w:p>
+            <w:pPr>
+              <w:pStyle w:val="TableText"/>
+              <w:keepLines/>
+            </w:pPr>
+            <w:r>
+              <w:rPr>
+                <w:sz w:val="15"/>
+                <w:szCs w:val="15"/>
+              </w:rPr>
+              <w:t xml:space="preserve">38 / 30</w:t>
+            </w:r>
+          </w:p>
+        </w:tc>
+        <w:tc>
+          <w:tcPr>
+            <w:tcW w:w="900" w:type="dxa"/>
+          </w:tcPr>
+          <w:p>
+            <w:pPr>
+              <w:pStyle w:val="TableText"/>
+              <w:keepLines/>
+            </w:pPr>
+            <w:r>
+              <w:rPr>
+                <w:sz w:val="15"/>
+                <w:szCs w:val="15"/>
+              </w:rPr>
+              <w:t xml:space="preserve">PASS</w:t>
+            </w:r>
+          </w:p>
+        </w:tc>
+      </w:tr>
+      <w:tr>
+        <w:trPr>
+          <w:cantSplit/>
+        </w:trPr>
+        <w:tc>
+          <w:tcPr>
+            <w:tcW w:w="1900" w:type="dxa"/>
+          </w:tcPr>
+          <w:p>
+            <w:pPr>
+              <w:pStyle w:val="TableText"/>
+              <w:keepLines/>
+            </w:pPr>
+            <w:r>
+              <w:rPr>
+                <w:sz w:val="15"/>
+                <w:szCs w:val="15"/>
+              </w:rPr>
+              <w:t xml:space="preserve">Persistent UPI adoption trend</w:t>
+            </w:r>
+          </w:p>
+        </w:tc>
+        <w:tc>
+          <w:tcPr>
+            <w:tcW w:w="3100" w:type="dxa"/>
+          </w:tcPr>
+          <w:p>
+            <w:pPr>
+              <w:pStyle w:val="TableText"/>
+              <w:keepLines/>
+            </w:pPr>
+            <w:r>
+              <w:rPr>
+                <w:sz w:val="15"/>
+                <w:szCs w:val="15"/>
+              </w:rPr>
+              <w:t xml:space="preserve">log_upi_transactions_per_capita ~ trend + calendar_month_effects + covid_level + post_covid_slope</w:t>
+            </w:r>
+          </w:p>
+        </w:tc>
+        <w:tc>
+          <w:tcPr>
+            <w:tcW w:w="1700" w:type="dxa"/>
+          </w:tcPr>
+          <w:p>
+            <w:pPr>
+              <w:pStyle w:val="TableText"/>
+              <w:keepLines/>
+            </w:pPr>
+            <w:r>
+              <w:rPr>
+                <w:sz w:val="15"/>
+                <w:szCs w:val="15"/>
+              </w:rPr>
+              <w:t xml:space="preserve">2017-04-30 → 2025-12-31</w:t>
+            </w:r>
+          </w:p>
+        </w:tc>
+        <w:tc>
+          <w:tcPr>
+            <w:tcW w:w="1400" w:type="dxa"/>
+          </w:tcPr>
+          <w:p>
+            <w:pPr>
+              <w:pStyle w:val="TableText"/>
+              <w:keepLines/>
+            </w:pPr>
+            <w:r>
+              <w:rPr>
+                <w:sz w:val="15"/>
+                <w:szCs w:val="15"/>
+              </w:rPr>
+              <w:t xml:space="preserve">105 / 36</w:t>
+            </w:r>
+          </w:p>
+        </w:tc>
+        <w:tc>
+          <w:tcPr>
+            <w:tcW w:w="900" w:type="dxa"/>
+          </w:tcPr>
+          <w:p>
+            <w:pPr>
+              <w:pStyle w:val="TableText"/>
+              <w:keepLines/>
+            </w:pPr>
+            <w:r>
+              <w:rPr>
+                <w:sz w:val="15"/>
+                <w:szCs w:val="15"/>
+              </w:rPr>
+              <w:t xml:space="preserve">PASS</w:t>
+            </w:r>
+          </w:p>
+        </w:tc>
+      </w:tr>
+    </w:tbl>
+    <w:p>
+      <w:pPr>
+        <w:spacing w:after="80"/>
+      </w:pPr>
+      <w:r>
+        <w:t xml:space="preserve"/>
+      </w:r>
+    </w:p>
+    <w:p>
+      <w:r>
+        <w:t xml:space="preserve">Both fiscal specifications accept actual and revised observations, use fiscal-period-safe lags, require at least 30 complete observations and register HAC uncertainty with maximum lag two. Focal terms and their expected directions are frozen: positive lagged debt for the interest-burden change model, negative lagged primary balance for the debt-change model, and a positive annualised underlying UPI trend. The UPI specification begins in April 2017, log-transforms transactions per capita, registers calendar-month effects and a pandemic break, requires at least 36 observations and uses HAC uncertainty with maximum lag twelve. All three are explicitly associational, not causal.</w:t>
+      </w:r>
+    </w:p>
+    <w:p>
+      <w:pPr>
+        <w:keepLines/>
+        <w:spacing w:before="120" w:after="160"/>
+        <w:ind w:left="180"/>
+        <w:pBdr>
+          <w:left w:val="single" w:sz="18" w:space="10" w:color="2E7D6B"/>
+        </w:pBdr>
+        <w:shd w:val="clear" w:color="auto" w:fill="ECFDF5"/>
+      </w:pPr>
+      <w:r>
+        <w:rPr>
+          <w:b/>
+          <w:color w:val="2E7D6B"/>
+        </w:rPr>
+        <w:t xml:space="preserve">Exclusions are data  </w:t>
+      </w:r>
+      <w:r>
+        <w:t xml:space="preserve">Disallowed statuses, unavailable differences or lags, pre-start observations, null values and non-positive inputs to logarithms are counted by input and reason. Gaps break differences; the pipeline does not bridge them or pull a later observation backward.</w:t>
+      </w:r>
+    </w:p>
+    <w:p>
+      <w:pPr>
+        <w:pStyle w:val="Heading2"/>
+        <w:keepNext/>
+      </w:pPr>
+      <w:r>
+        <w:t xml:space="preserve">Published evidence results</w:t>
+      </w:r>
+    </w:p>
+    <w:tbl>
+      <w:tblPr>
+        <w:tblStyle w:val="ArchitectureTable"/>
+        <w:tblW w:w="0" w:type="auto"/>
+        <w:tblLayout w:type="fixed"/>
+        <w:tblLook w:val="04A0" w:firstRow="1" w:lastRow="0" w:firstColumn="0" w:lastColumn="0" w:noHBand="0" w:noVBand="1"/>
+      </w:tblPr>
+      <w:tblGrid>
+        <w:gridCol w:w="2500"/>
+        <w:gridCol w:w="1700"/>
+        <w:gridCol w:w="3000"/>
+        <w:gridCol w:w="1800"/>
+      </w:tblGrid>
+      <w:tr>
+        <w:trPr>
+          <w:tblHeader/>
+          <w:cantSplit/>
+        </w:trPr>
+        <w:tc>
+          <w:tcPr>
+            <w:tcW w:w="2500" w:type="dxa"/>
+            <w:shd w:val="clear" w:color="auto" w:fill="1F4E78"/>
+          </w:tcPr>
+          <w:p>
+            <w:pPr>
+              <w:pStyle w:val="TableText"/>
+              <w:keepLines/>
+            </w:pPr>
+            <w:r>
+              <w:rPr>
+                <w:b/>
+                <w:color w:val="FFFFFF"/>
+                <w:sz w:val="15"/>
+                <w:szCs w:val="15"/>
+              </w:rPr>
+              <w:t xml:space="preserve">Analysis</w:t>
+            </w:r>
+          </w:p>
+        </w:tc>
+        <w:tc>
+          <w:tcPr>
+            <w:tcW w:w="1700" w:type="dxa"/>
+            <w:shd w:val="clear" w:color="auto" w:fill="1F4E78"/>
+          </w:tcPr>
+          <w:p>
+            <w:pPr>
+              <w:pStyle w:val="TableText"/>
+              <w:keepLines/>
+            </w:pPr>
+            <w:r>
+              <w:rPr>
+                <w:b/>
+                <w:color w:val="FFFFFF"/>
+                <w:sz w:val="15"/>
+                <w:szCs w:val="15"/>
+              </w:rPr>
+              <w:t xml:space="preserve">Status / grade</w:t>
+            </w:r>
+          </w:p>
+        </w:tc>
+        <w:tc>
+          <w:tcPr>
+            <w:tcW w:w="3000" w:type="dxa"/>
+            <w:shd w:val="clear" w:color="auto" w:fill="1F4E78"/>
+          </w:tcPr>
+          <w:p>
+            <w:pPr>
+              <w:pStyle w:val="TableText"/>
+              <w:keepLines/>
+            </w:pPr>
+            <w:r>
+              <w:rPr>
+                <w:b/>
+                <w:color w:val="FFFFFF"/>
+                <w:sz w:val="15"/>
+                <w:szCs w:val="15"/>
+              </w:rPr>
+              <w:t xml:space="preserve">Registered focal estimate</w:t>
+            </w:r>
+          </w:p>
+        </w:tc>
+        <w:tc>
+          <w:tcPr>
+            <w:tcW w:w="1800" w:type="dxa"/>
+            <w:shd w:val="clear" w:color="auto" w:fill="1F4E78"/>
+          </w:tcPr>
+          <w:p>
+            <w:pPr>
+              <w:pStyle w:val="TableText"/>
+              <w:keepLines/>
+            </w:pPr>
+            <w:r>
+              <w:rPr>
+                <w:b/>
+                <w:color w:val="FFFFFF"/>
+                <w:sz w:val="15"/>
+                <w:szCs w:val="15"/>
+              </w:rPr>
+              <w:t xml:space="preserve">Failed diagnostics</w:t>
+            </w:r>
+          </w:p>
+        </w:tc>
+      </w:tr>
+      <w:tr>
+        <w:trPr>
+          <w:cantSplit/>
+        </w:trPr>
+        <w:tc>
+          <w:tcPr>
+            <w:tcW w:w="2500" w:type="dxa"/>
+          </w:tcPr>
+          <w:p>
+            <w:pPr>
+              <w:pStyle w:val="TableText"/>
+              <w:keepLines/>
+            </w:pPr>
+            <w:r>
+              <w:rPr>
+                <w:sz w:val="15"/>
+                <w:szCs w:val="15"/>
+              </w:rPr>
+              <w:t xml:space="preserve">Lagged debt and change in interest burden</w:t>
+            </w:r>
+          </w:p>
+        </w:tc>
+        <w:tc>
+          <w:tcPr>
+            <w:tcW w:w="1700" w:type="dxa"/>
+          </w:tcPr>
+          <w:p>
+            <w:pPr>
+              <w:pStyle w:val="TableText"/>
+              <w:keepLines/>
+            </w:pPr>
+            <w:r>
+              <w:rPr>
+                <w:sz w:val="15"/>
+                <w:szCs w:val="15"/>
+              </w:rPr>
+              <w:t xml:space="preserve">not_supported / limited</w:t>
+            </w:r>
+          </w:p>
+        </w:tc>
+        <w:tc>
+          <w:tcPr>
+            <w:tcW w:w="3000" w:type="dxa"/>
+          </w:tcPr>
+          <w:p>
+            <w:pPr>
+              <w:pStyle w:val="TableText"/>
+              <w:keepLines/>
+            </w:pPr>
+            <w:r>
+              <w:rPr>
+                <w:sz w:val="15"/>
+                <w:szCs w:val="15"/>
+              </w:rPr>
+              <w:t xml:space="preserve">-0.193 interest_burden_percentage_point_change_per_debt_percentage_point</w:t>
+            </w:r>
+          </w:p>
+          <w:p>
+            <w:pPr>
+              <w:pStyle w:val="TableText"/>
+              <w:keepLines/>
+            </w:pPr>
+            <w:r>
+              <w:rPr>
+                <w:sz w:val="15"/>
+                <w:szCs w:val="15"/>
+              </w:rPr>
+              <w:t xml:space="preserve">95% CI -0.347 to -0.039</w:t>
+            </w:r>
+          </w:p>
+          <w:p>
+            <w:pPr>
+              <w:pStyle w:val="TableText"/>
+              <w:keepLines/>
+            </w:pPr>
+            <w:r>
+              <w:rPr>
+                <w:sz w:val="15"/>
+                <w:szCs w:val="15"/>
+              </w:rPr>
+              <w:t xml:space="preserve">adjusted p=0.03062</w:t>
+            </w:r>
+          </w:p>
+        </w:tc>
+        <w:tc>
+          <w:tcPr>
+            <w:tcW w:w="1800" w:type="dxa"/>
+          </w:tcPr>
+          <w:p>
+            <w:pPr>
+              <w:pStyle w:val="TableText"/>
+              <w:keepLines/>
+            </w:pPr>
+            <w:r>
+              <w:rPr>
+                <w:sz w:val="15"/>
+                <w:szCs w:val="15"/>
+              </w:rPr>
+              <w:t xml:space="preserve">All registered diagnostics passed</w:t>
+            </w:r>
+          </w:p>
+        </w:tc>
+      </w:tr>
+      <w:tr>
+        <w:trPr>
+          <w:cantSplit/>
+        </w:trPr>
+        <w:tc>
+          <w:tcPr>
+            <w:tcW w:w="2500" w:type="dxa"/>
+          </w:tcPr>
+          <w:p>
+            <w:pPr>
+              <w:pStyle w:val="TableText"/>
+              <w:keepLines/>
+            </w:pPr>
+            <w:r>
+              <w:rPr>
+                <w:sz w:val="15"/>
+                <w:szCs w:val="15"/>
+              </w:rPr>
+              <w:t xml:space="preserve">Primary balance and subsequent debt movement</w:t>
+            </w:r>
+          </w:p>
+        </w:tc>
+        <w:tc>
+          <w:tcPr>
+            <w:tcW w:w="1700" w:type="dxa"/>
+          </w:tcPr>
+          <w:p>
+            <w:pPr>
+              <w:pStyle w:val="TableText"/>
+              <w:keepLines/>
+            </w:pPr>
+            <w:r>
+              <w:rPr>
+                <w:sz w:val="15"/>
+                <w:szCs w:val="15"/>
+              </w:rPr>
+              <w:t xml:space="preserve">failed_diagnostics / limited</w:t>
+            </w:r>
+          </w:p>
+        </w:tc>
+        <w:tc>
+          <w:tcPr>
+            <w:tcW w:w="3000" w:type="dxa"/>
+          </w:tcPr>
+          <w:p>
+            <w:pPr>
+              <w:pStyle w:val="TableText"/>
+              <w:keepLines/>
+            </w:pPr>
+            <w:r>
+              <w:rPr>
+                <w:sz w:val="15"/>
+                <w:szCs w:val="15"/>
+              </w:rPr>
+              <w:t xml:space="preserve">0.294 debt_percentage_point_change_per_primary_balance_percentage_point</w:t>
+            </w:r>
+          </w:p>
+          <w:p>
+            <w:pPr>
+              <w:pStyle w:val="TableText"/>
+              <w:keepLines/>
+            </w:pPr>
+            <w:r>
+              <w:rPr>
+                <w:sz w:val="15"/>
+                <w:szCs w:val="15"/>
+              </w:rPr>
+              <w:t xml:space="preserve">95% CI -0.749 to 1.338</w:t>
+            </w:r>
+          </w:p>
+          <w:p>
+            <w:pPr>
+              <w:pStyle w:val="TableText"/>
+              <w:keepLines/>
+            </w:pPr>
+            <w:r>
+              <w:rPr>
+                <w:sz w:val="15"/>
+                <w:szCs w:val="15"/>
+              </w:rPr>
+              <w:t xml:space="preserve">adjusted p=0.5702</w:t>
+            </w:r>
+          </w:p>
+        </w:tc>
+        <w:tc>
+          <w:tcPr>
+            <w:tcW w:w="1800" w:type="dxa"/>
+          </w:tcPr>
+          <w:p>
+            <w:pPr>
+              <w:pStyle w:val="TableText"/>
+              <w:keepLines/>
+            </w:pPr>
+            <w:r>
+              <w:rPr>
+                <w:sz w:val="15"/>
+                <w:szCs w:val="15"/>
+              </w:rPr>
+              <w:t xml:space="preserve">influential_observation</w:t>
+            </w:r>
+          </w:p>
+        </w:tc>
+      </w:tr>
+      <w:tr>
+        <w:trPr>
+          <w:cantSplit/>
+        </w:trPr>
+        <w:tc>
+          <w:tcPr>
+            <w:tcW w:w="2500" w:type="dxa"/>
+          </w:tcPr>
+          <w:p>
+            <w:pPr>
+              <w:pStyle w:val="TableText"/>
+              <w:keepLines/>
+            </w:pPr>
+            <w:r>
+              <w:rPr>
+                <w:sz w:val="15"/>
+                <w:szCs w:val="15"/>
+              </w:rPr>
+              <w:t xml:space="preserve">Persistent UPI adoption trend</w:t>
+            </w:r>
+          </w:p>
+        </w:tc>
+        <w:tc>
+          <w:tcPr>
+            <w:tcW w:w="1700" w:type="dxa"/>
+          </w:tcPr>
+          <w:p>
+            <w:pPr>
+              <w:pStyle w:val="TableText"/>
+              <w:keepLines/>
+            </w:pPr>
+            <w:r>
+              <w:rPr>
+                <w:sz w:val="15"/>
+                <w:szCs w:val="15"/>
+              </w:rPr>
+              <w:t xml:space="preserve">failed_diagnostics / limited</w:t>
+            </w:r>
+          </w:p>
+        </w:tc>
+        <w:tc>
+          <w:tcPr>
+            <w:tcW w:w="3000" w:type="dxa"/>
+          </w:tcPr>
+          <w:p>
+            <w:pPr>
+              <w:pStyle w:val="TableText"/>
+              <w:keepLines/>
+            </w:pPr>
+            <w:r>
+              <w:rPr>
+                <w:sz w:val="15"/>
+                <w:szCs w:val="15"/>
+              </w:rPr>
+              <w:t xml:space="preserve">410.826 percent_per_year</w:t>
+            </w:r>
+          </w:p>
+          <w:p>
+            <w:pPr>
+              <w:pStyle w:val="TableText"/>
+              <w:keepLines/>
+            </w:pPr>
+            <w:r>
+              <w:rPr>
+                <w:sz w:val="15"/>
+                <w:szCs w:val="15"/>
+              </w:rPr>
+              <w:t xml:space="preserve">95% CI 206.650 to 750.949</w:t>
+            </w:r>
+          </w:p>
+          <w:p>
+            <w:pPr>
+              <w:pStyle w:val="TableText"/>
+              <w:keepLines/>
+            </w:pPr>
+            <w:r>
+              <w:rPr>
+                <w:sz w:val="15"/>
+                <w:szCs w:val="15"/>
+              </w:rPr>
+              <w:t xml:space="preserve">adjusted p=8.621e-09</w:t>
+            </w:r>
+          </w:p>
+        </w:tc>
+        <w:tc>
+          <w:tcPr>
+            <w:tcW w:w="1800" w:type="dxa"/>
+          </w:tcPr>
+          <w:p>
+            <w:pPr>
+              <w:pStyle w:val="TableText"/>
+              <w:keepLines/>
+            </w:pPr>
+            <w:r>
+              <w:rPr>
+                <w:sz w:val="15"/>
+                <w:szCs w:val="15"/>
+              </w:rPr>
+              <w:t xml:space="preserve">residual_autocorrelation</w:t>
+            </w:r>
+          </w:p>
+        </w:tc>
+      </w:tr>
+    </w:tbl>
+    <w:p>
+      <w:pPr>
+        <w:spacing w:after="80"/>
+      </w:pPr>
+      <w:r>
+        <w:t xml:space="preserve"/>
+      </w:r>
+    </w:p>
+    <w:p>
+      <w:pPr>
+        <w:keepLines/>
+        <w:spacing w:before="120" w:after="160"/>
+        <w:ind w:left="180"/>
+        <w:pBdr>
+          <w:left w:val="single" w:sz="18" w:space="10" w:color="A33D4A"/>
+        </w:pBdr>
+        <w:shd w:val="clear" w:color="auto" w:fill="FFF1F2"/>
+      </w:pPr>
+      <w:r>
+        <w:rPr>
+          <w:b/>
+          <w:color w:val="A33D4A"/>
+        </w:rPr>
+        <w:t xml:space="preserve">Interpretation boundary  </w:t>
+      </w:r>
+      <w:r>
+        <w:t xml:space="preserve">The negative debt/interest-burden coefficient is opposite the registered positive direction and is therefore not support for the claim even though its adjusted p-value is below 0.05. The primary-balance model fails the influence diagnostic. The UPI trend is positive in every registered robustness fit but fails the residual-autocorrelation diagnostic. None of these observational results establishes a policy effect.</w:t>
       </w:r>
     </w:p>
     <w:p>
@@ -4829,6 +6011,47 @@
                 <w:szCs w:val="18"/>
               </w:rPr>
               <w:t xml:space="preserve">Draft 2020-12 JSON Schema validation of data bundles and the frontend catalogue.</w:t>
+            </w:r>
+          </w:p>
+        </w:tc>
+      </w:tr>
+      <w:tr>
+        <w:trPr>
+          <w:cantSplit/>
+        </w:trPr>
+        <w:tc>
+          <w:tcPr>
+            <w:tcW w:w="1900" w:type="dxa"/>
+          </w:tcPr>
+          <w:p>
+            <w:pPr>
+              <w:pStyle w:val="TableText"/>
+              <w:keepLines/>
+            </w:pPr>
+            <w:r>
+              <w:rPr>
+                <w:sz w:val="18"/>
+                <w:szCs w:val="18"/>
+              </w:rPr>
+              <w:t xml:space="preserve">Evidence semantics</w:t>
+            </w:r>
+          </w:p>
+        </w:tc>
+        <w:tc>
+          <w:tcPr>
+            <w:tcW w:w="7100" w:type="dxa"/>
+          </w:tcPr>
+          <w:p>
+            <w:pPr>
+              <w:pStyle w:val="TableText"/>
+              <w:keepLines/>
+            </w:pPr>
+            <w:r>
+              <w:rPr>
+                <w:sz w:val="18"/>
+                <w:szCs w:val="18"/>
+              </w:rPr>
+              <w:t xml:space="preserve">Registry identity, analysis order, source coverage, sample dates, confidence intervals, adjusted p-values, insufficiency rules and non-causal language are checked across fields.</w:t>
             </w:r>
           </w:p>
         </w:tc>
@@ -16332,6 +17555,47 @@
                 <w:sz w:val="18"/>
                 <w:szCs w:val="18"/>
               </w:rPr>
+              <w:t xml:space="preserve">EvidencePanel</w:t>
+            </w:r>
+          </w:p>
+        </w:tc>
+        <w:tc>
+          <w:tcPr>
+            <w:tcW w:w="6000" w:type="dxa"/>
+          </w:tcPr>
+          <w:p>
+            <w:pPr>
+              <w:pStyle w:val="TableText"/>
+              <w:keepLines/>
+            </w:pPr>
+            <w:r>
+              <w:rPr>
+                <w:sz w:val="18"/>
+                <w:szCs w:val="18"/>
+              </w:rPr>
+              <w:t xml:space="preserve">For lenses with a valid evidence_asset_id, appears above the metric stack and renders full textual status, focal uncertainty, diagnostics, robustness, method and limitations.</w:t>
+            </w:r>
+          </w:p>
+        </w:tc>
+      </w:tr>
+      <w:tr>
+        <w:trPr>
+          <w:cantSplit/>
+        </w:trPr>
+        <w:tc>
+          <w:tcPr>
+            <w:tcW w:w="3000" w:type="dxa"/>
+          </w:tcPr>
+          <w:p>
+            <w:pPr>
+              <w:pStyle w:val="TableText"/>
+              <w:keepLines/>
+            </w:pPr>
+            <w:r>
+              <w:rPr>
+                <w:sz w:val="18"/>
+                <w:szCs w:val="18"/>
+              </w:rPr>
               <w:t xml:space="preserve">MetricPanel</w:t>
             </w:r>
           </w:p>
@@ -16619,6 +17883,47 @@
                 <w:sz w:val="18"/>
                 <w:szCs w:val="18"/>
               </w:rPr>
+              <w:t xml:space="preserve">Lens evidence</w:t>
+            </w:r>
+          </w:p>
+        </w:tc>
+        <w:tc>
+          <w:tcPr>
+            <w:tcW w:w="6400" w:type="dxa"/>
+          </w:tcPr>
+          <w:p>
+            <w:pPr>
+              <w:pStyle w:val="TableText"/>
+              <w:keepLines/>
+            </w:pPr>
+            <w:r>
+              <w:rPr>
+                <w:sz w:val="18"/>
+                <w:szCs w:val="18"/>
+              </w:rPr>
+              <w:t xml:space="preserve">Only an existing, semantically validated evidence report creates evidence_asset_id. Evidence is not represented as a time-series indicator or recomputed in the browser.</w:t>
+            </w:r>
+          </w:p>
+        </w:tc>
+      </w:tr>
+      <w:tr>
+        <w:trPr>
+          <w:cantSplit/>
+        </w:trPr>
+        <w:tc>
+          <w:tcPr>
+            <w:tcW w:w="2600" w:type="dxa"/>
+          </w:tcPr>
+          <w:p>
+            <w:pPr>
+              <w:pStyle w:val="TableText"/>
+              <w:keepLines/>
+            </w:pPr>
+            <w:r>
+              <w:rPr>
+                <w:sz w:val="18"/>
+                <w:szCs w:val="18"/>
+              </w:rPr>
               <w:t xml:space="preserve">Country comparison default</w:t>
             </w:r>
           </w:p>
@@ -16744,7 +18049,7 @@
     </w:p>
     <w:p>
       <w:r>
-        <w:t xml:space="preserve">useCatalogue loads /data/catalogue.json with React Query. useIndicatorData does not issue a request for planned assets. For a delivered asset, the version is included in the query identity/cache-busting path and the fetch uses revalidation/no-cache semantics. Loading and network/schema failures are rendered in place.</w:t>
+        <w:t xml:space="preserve">useCatalogue loads /data/catalogue.json with React Query. useIndicatorData does not issue a request for planned assets. useEvidenceData separately loads lens-level evidence and applies the evidence runtime guard. For a delivered asset, the version is included in the query identity/cache-busting path and the fetch uses revalidation/no-cache semantics. Loading and network/schema failures are rendered in place.</w:t>
       </w:r>
     </w:p>
     <w:p>
@@ -16809,6 +18114,11 @@
       </w:r>
     </w:p>
     <w:p>
+      <w:r>
+        <w:t xml:space="preserve">EvidencePanel deliberately has no chart adapter. Status labels spell out not-supported, mixed, failed-diagnostics or supported states; failed diagnostics are surfaced before the collapsed technical tables. Readers can expand all estimates, confidence intervals, raw/adjusted p-values, diagnostics, robustness fits, formula, causal flag and provenance.</w:t>
+      </w:r>
+    </w:p>
+    <w:p>
       <w:pPr>
         <w:pStyle w:val="Heading2"/>
         <w:keepNext/>
@@ -16819,7 +18129,7 @@
     </w:p>
     <w:p>
       <w:r>
-        <w:t xml:space="preserve">The frontend build validates catalogue structure, every active/partial asset, schema references, metadata coverage, duplicate identities and component/schema compatibility before TypeScript and Vite compilation. The result is a static dist directory suitable for ordinary static hosting. The previous build completed successfully; the only noted warning was a roughly 646 kB minified JavaScript chunk, a performance optimisation opportunity rather than a correctness failure.</w:t>
+        <w:t xml:space="preserve">The frontend build validates catalogue structure, every active/partial asset, both evidence reports, schema references, metadata coverage, duplicate identities and component/schema compatibility before TypeScript and Vite compilation. The result is a static dist directory suitable for ordinary static hosting. The previous build completed successfully; the only noted warning was a roughly 655 kB minified JavaScript chunk, a performance optimisation opportunity rather than a correctness failure.</w:t>
       </w:r>
     </w:p>
     <w:p>
@@ -16921,8 +18231,50 @@
         <w:keepLines/>
       </w:pPr>
       <w:r>
-        <w:t xml:space="preserve">PYTHONDONTWRITEBYTECODE=1 python3 -m unittest discover -s tests
+        <w:t xml:space="preserve">PYTHONDONTWRITEBYTECODE=1 venv/bin/python -m unittest discover -s tests
 cd frontend &amp;&amp; npm run build</w:t>
+      </w:r>
+    </w:p>
+    <w:p>
+      <w:r>
+        <w:t xml:space="preserve">Inspect registered samples and eligibility without estimating coefficients:</w:t>
+      </w:r>
+    </w:p>
+    <w:p>
+      <w:pPr>
+        <w:pStyle w:val="Code"/>
+        <w:keepLines/>
+      </w:pPr>
+      <w:r>
+        <w:t xml:space="preserve">PYTHONDONTWRITEBYTECODE=1 python3 scripts/audit_evidence_readiness.py</w:t>
+      </w:r>
+    </w:p>
+    <w:p>
+      <w:r>
+        <w:t xml:space="preserve">Rebuild, validate and promote the registered evidence reports using the project environment:</w:t>
+      </w:r>
+    </w:p>
+    <w:p>
+      <w:pPr>
+        <w:pStyle w:val="Code"/>
+        <w:keepLines/>
+      </w:pPr>
+      <w:r>
+        <w:t xml:space="preserve">PYTHONDONTWRITEBYTECODE=1 venv/bin/python scripts/build_evidence_reports.py --promote</w:t>
+      </w:r>
+    </w:p>
+    <w:p>
+      <w:r>
+        <w:t xml:space="preserve">Independently reproduce the main estimates, diagnostics and grades through the review code path:</w:t>
+      </w:r>
+    </w:p>
+    <w:p>
+      <w:pPr>
+        <w:pStyle w:val="Code"/>
+        <w:keepLines/>
+      </w:pPr>
+      <w:r>
+        <w:t xml:space="preserve">PYTHONDONTWRITEBYTECODE=1 venv/bin/python scripts/review_evidence_reports.py</w:t>
       </w:r>
     </w:p>
     <w:p>
@@ -17389,7 +18741,7 @@
     </w:p>
     <w:p>
       <w:r>
-        <w:t xml:space="preserve">At the implementation snapshot, the backend suite reported 28 passing tests and one skipped optional pandas/yfinance test. The frontend TypeScript/Vite build and static-data validation also passed. Tests cover canonical periods/status, registry contracts, formulas and rolling-window behaviour, schema validation, exporter atomicity, focused builders/catalogue logic, and source-specific GST/OBICUS parsing fixtures. A successful test run does not replace a data-review check for revisions or economic plausibility.</w:t>
+        <w:t xml:space="preserve">At the implementation snapshot, the complete project environment reported 61 passing backend tests. The frontend TypeScript/Vite build and static-data validation also passed, validating 22 catalogue assets, two evidence reports and 13 sections. Tests cover canonical periods/status, registry contracts, formulas and rolling-window behaviour, schema validation, exporter atomicity, focused builders/catalogue logic, evidence catalogue registration, source-specific GST/OBICUS parsing fixtures, registered evidence loading, no-look-ahead alignment, eligibility gates, OLS/HAC estimation, rank rejection, robustness design, evidence-report semantics and non-destructive promotion. The separate numerical review reproduced every main estimate, interval, p-value adjustment, diagnostic flag, status and grade at tolerance 1e-9. These checks do not replace external peer review.</w:t>
       </w:r>
     </w:p>
     <w:p>
@@ -17631,6 +18983,124 @@
                 <w:sz w:val="18"/>
                 <w:szCs w:val="18"/>
               </w:rPr>
+              <w:t xml:space="preserve">External analytical review</w:t>
+            </w:r>
+          </w:p>
+        </w:tc>
+        <w:tc>
+          <w:tcPr>
+            <w:tcW w:w="5000" w:type="dxa"/>
+          </w:tcPr>
+          <w:p>
+            <w:pPr>
+              <w:pStyle w:val="TableText"/>
+              <w:keepLines/>
+            </w:pPr>
+            <w:r>
+              <w:rPr>
+                <w:sz w:val="18"/>
+                <w:szCs w:val="18"/>
+              </w:rPr>
+              <w:t xml:space="preserve">An independent reviewer checks source definitions, specification versions 1.0.0–1.2.0, generated wording and the two diagnostic failures before policy conclusions are drawn.</w:t>
+            </w:r>
+          </w:p>
+        </w:tc>
+      </w:tr>
+      <w:tr>
+        <w:trPr>
+          <w:cantSplit/>
+        </w:trPr>
+        <w:tc>
+          <w:tcPr>
+            <w:tcW w:w="900" w:type="dxa"/>
+          </w:tcPr>
+          <w:p>
+            <w:pPr>
+              <w:pStyle w:val="TableText"/>
+              <w:keepLines/>
+            </w:pPr>
+            <w:r>
+              <w:rPr>
+                <w:sz w:val="18"/>
+                <w:szCs w:val="18"/>
+              </w:rPr>
+              <w:t xml:space="preserve">2</w:t>
+            </w:r>
+          </w:p>
+        </w:tc>
+        <w:tc>
+          <w:tcPr>
+            <w:tcW w:w="3100" w:type="dxa"/>
+          </w:tcPr>
+          <w:p>
+            <w:pPr>
+              <w:pStyle w:val="TableText"/>
+              <w:keepLines/>
+            </w:pPr>
+            <w:r>
+              <w:rPr>
+                <w:sz w:val="18"/>
+                <w:szCs w:val="18"/>
+              </w:rPr>
+              <w:t xml:space="preserve">Future UPI serial-dependence specification</w:t>
+            </w:r>
+          </w:p>
+        </w:tc>
+        <w:tc>
+          <w:tcPr>
+            <w:tcW w:w="5000" w:type="dxa"/>
+          </w:tcPr>
+          <w:p>
+            <w:pPr>
+              <w:pStyle w:val="TableText"/>
+              <w:keepLines/>
+            </w:pPr>
+            <w:r>
+              <w:rPr>
+                <w:sz w:val="18"/>
+                <w:szCs w:val="18"/>
+              </w:rPr>
+              <w:t xml:space="preserve">If pursued, register a new version before estimation with a model appropriate to the residual dependence; retain the published version-1 result unchanged.</w:t>
+            </w:r>
+          </w:p>
+        </w:tc>
+      </w:tr>
+      <w:tr>
+        <w:trPr>
+          <w:cantSplit/>
+        </w:trPr>
+        <w:tc>
+          <w:tcPr>
+            <w:tcW w:w="900" w:type="dxa"/>
+          </w:tcPr>
+          <w:p>
+            <w:pPr>
+              <w:pStyle w:val="TableText"/>
+              <w:keepLines/>
+            </w:pPr>
+            <w:r>
+              <w:rPr>
+                <w:sz w:val="18"/>
+                <w:szCs w:val="18"/>
+              </w:rPr>
+              <w:t xml:space="preserve">3</w:t>
+            </w:r>
+          </w:p>
+        </w:tc>
+        <w:tc>
+          <w:tcPr>
+            <w:tcW w:w="3100" w:type="dxa"/>
+          </w:tcPr>
+          <w:p>
+            <w:pPr>
+              <w:pStyle w:val="TableText"/>
+              <w:keepLines/>
+            </w:pPr>
+            <w:r>
+              <w:rPr>
+                <w:sz w:val="18"/>
+                <w:szCs w:val="18"/>
+              </w:rPr>
               <w:t xml:space="preserve">Historical institutional-flow archive</w:t>
             </w:r>
           </w:p>
@@ -17672,7 +19142,7 @@
                 <w:sz w:val="18"/>
                 <w:szCs w:val="18"/>
               </w:rPr>
-              <w:t xml:space="preserve">2</w:t>
+              <w:t xml:space="preserve">4</w:t>
             </w:r>
           </w:p>
         </w:tc>
@@ -17708,7 +19178,7 @@
                 <w:sz w:val="18"/>
                 <w:szCs w:val="18"/>
               </w:rPr>
-              <w:t xml:space="preserve">The configured 2018 EM sell-off, COVID-19 and 2022 tightening windows can be populated from adequate flow/market history and validated against event_study.schema.json.</w:t>
+              <w:t xml:space="preserve">Only after sufficient flow/market history, the configured 2018 EM sell-off, COVID-19 and 2022 tightening windows are populated and validated against event_study.schema.json.</w:t>
             </w:r>
           </w:p>
         </w:tc>
@@ -17731,7 +19201,7 @@
                 <w:sz w:val="18"/>
                 <w:szCs w:val="18"/>
               </w:rPr>
-              <w:t xml:space="preserve">3</w:t>
+              <w:t xml:space="preserve">5</w:t>
             </w:r>
           </w:p>
         </w:tc>
@@ -17790,7 +19260,7 @@
                 <w:sz w:val="18"/>
                 <w:szCs w:val="18"/>
               </w:rPr>
-              <w:t xml:space="preserve">4</w:t>
+              <w:t xml:space="preserve">6</w:t>
             </w:r>
           </w:p>
         </w:tc>
@@ -17808,7 +19278,7 @@
                 <w:sz w:val="18"/>
                 <w:szCs w:val="18"/>
               </w:rPr>
-              <w:t xml:space="preserve">Frontend performance</w:t>
+              <w:t xml:space="preserve">Frontend performance and document automation</w:t>
             </w:r>
           </w:p>
         </w:tc>
@@ -17826,7 +19296,7 @@
                 <w:sz w:val="18"/>
                 <w:szCs w:val="18"/>
               </w:rPr>
-              <w:t xml:space="preserve">Route/chart code splitting or other bundle reduction removes the large-chunk warning without weakening validation.</w:t>
+              <w:t xml:space="preserve">Reduce the large JavaScript chunk and generate this guide in a release job without weakening validation.</w:t>
             </w:r>
           </w:p>
         </w:tc>
@@ -17849,7 +19319,7 @@
                 <w:sz w:val="18"/>
                 <w:szCs w:val="18"/>
               </w:rPr>
-              <w:t xml:space="preserve">5</w:t>
+              <w:t xml:space="preserve">7</w:t>
             </w:r>
           </w:p>
         </w:tc>
@@ -17890,65 +19360,6 @@
           </w:p>
         </w:tc>
       </w:tr>
-      <w:tr>
-        <w:trPr>
-          <w:cantSplit/>
-        </w:trPr>
-        <w:tc>
-          <w:tcPr>
-            <w:tcW w:w="900" w:type="dxa"/>
-          </w:tcPr>
-          <w:p>
-            <w:pPr>
-              <w:pStyle w:val="TableText"/>
-              <w:keepLines/>
-            </w:pPr>
-            <w:r>
-              <w:rPr>
-                <w:sz w:val="18"/>
-                <w:szCs w:val="18"/>
-              </w:rPr>
-              <w:t xml:space="preserve">6</w:t>
-            </w:r>
-          </w:p>
-        </w:tc>
-        <w:tc>
-          <w:tcPr>
-            <w:tcW w:w="3100" w:type="dxa"/>
-          </w:tcPr>
-          <w:p>
-            <w:pPr>
-              <w:pStyle w:val="TableText"/>
-              <w:keepLines/>
-            </w:pPr>
-            <w:r>
-              <w:rPr>
-                <w:sz w:val="18"/>
-                <w:szCs w:val="18"/>
-              </w:rPr>
-              <w:t xml:space="preserve">Automated document freshness</w:t>
-            </w:r>
-          </w:p>
-        </w:tc>
-        <w:tc>
-          <w:tcPr>
-            <w:tcW w:w="5000" w:type="dxa"/>
-          </w:tcPr>
-          <w:p>
-            <w:pPr>
-              <w:pStyle w:val="TableText"/>
-              <w:keepLines/>
-            </w:pPr>
-            <w:r>
-              <w:rPr>
-                <w:sz w:val="18"/>
-                <w:szCs w:val="18"/>
-              </w:rPr>
-              <w:t xml:space="preserve">Generate the DOCX in a release/documentation job and fail when registry series lack architecture notes.</w:t>
-            </w:r>
-          </w:p>
-        </w:tc>
-      </w:tr>
     </w:tbl>
     <w:p>
       <w:pPr>
@@ -17956,6 +19367,27 @@
       </w:pPr>
       <w:r>
         <w:t xml:space="preserve"/>
+      </w:r>
+    </w:p>
+    <w:p>
+      <w:pPr>
+        <w:keepLines/>
+        <w:spacing w:before="120" w:after="160"/>
+        <w:ind w:left="180"/>
+        <w:pBdr>
+          <w:left w:val="single" w:sz="18" w:space="10" w:color="2E7D6B"/>
+        </w:pBdr>
+        <w:shd w:val="clear" w:color="auto" w:fill="ECFDF5"/>
+      </w:pPr>
+      <w:r>
+        <w:rPr>
+          <w:b/>
+          <w:color w:val="2E7D6B"/>
+        </w:rPr>
+        <w:t xml:space="preserve">Immediate next gate  </w:t>
+      </w:r>
+      <w:r>
+        <w:t xml:space="preserve">Keep the version-1 reports visible with their limitations and obtain external analytical review. Any new UPI model must be registered as a new version before its coefficients are inspected; the failed residual-autocorrelation diagnostic must not be erased by retuning the published specification.</w:t>
       </w:r>
     </w:p>
     <w:p>
@@ -19357,6 +20789,88 @@
                 <w:sz w:val="18"/>
                 <w:szCs w:val="18"/>
               </w:rPr>
+              <w:t xml:space="preserve">Eligibility gate</w:t>
+            </w:r>
+          </w:p>
+        </w:tc>
+        <w:tc>
+          <w:tcPr>
+            <w:tcW w:w="6400" w:type="dxa"/>
+          </w:tcPr>
+          <w:p>
+            <w:pPr>
+              <w:pStyle w:val="TableText"/>
+              <w:keepLines/>
+            </w:pPr>
+            <w:r>
+              <w:rPr>
+                <w:sz w:val="18"/>
+                <w:szCs w:val="18"/>
+              </w:rPr>
+              <w:t xml:space="preserve">A pre-estimation rule on sample size, variation, degrees of freedom, rank and time ordering. Passing authorises estimation; it is not evidence for a claim.</w:t>
+            </w:r>
+          </w:p>
+        </w:tc>
+      </w:tr>
+      <w:tr>
+        <w:trPr>
+          <w:cantSplit/>
+        </w:trPr>
+        <w:tc>
+          <w:tcPr>
+            <w:tcW w:w="2600" w:type="dxa"/>
+          </w:tcPr>
+          <w:p>
+            <w:pPr>
+              <w:pStyle w:val="TableText"/>
+              <w:keepLines/>
+            </w:pPr>
+            <w:r>
+              <w:rPr>
+                <w:sz w:val="18"/>
+                <w:szCs w:val="18"/>
+              </w:rPr>
+              <w:t xml:space="preserve">Evidence grade</w:t>
+            </w:r>
+          </w:p>
+        </w:tc>
+        <w:tc>
+          <w:tcPr>
+            <w:tcW w:w="6400" w:type="dxa"/>
+          </w:tcPr>
+          <w:p>
+            <w:pPr>
+              <w:pStyle w:val="TableText"/>
+              <w:keepLines/>
+            </w:pPr>
+            <w:r>
+              <w:rPr>
+                <w:sz w:val="18"/>
+                <w:szCs w:val="18"/>
+              </w:rPr>
+              <w:t xml:space="preserve">A structured assessment carried by an evidence report after estimation, diagnostics and robustness—not a synonym for statistical significance.</w:t>
+            </w:r>
+          </w:p>
+        </w:tc>
+      </w:tr>
+      <w:tr>
+        <w:trPr>
+          <w:cantSplit/>
+        </w:trPr>
+        <w:tc>
+          <w:tcPr>
+            <w:tcW w:w="2600" w:type="dxa"/>
+          </w:tcPr>
+          <w:p>
+            <w:pPr>
+              <w:pStyle w:val="TableText"/>
+              <w:keepLines/>
+            </w:pPr>
+            <w:r>
+              <w:rPr>
+                <w:sz w:val="18"/>
+                <w:szCs w:val="18"/>
+              </w:rPr>
               <w:t xml:space="preserve">Nominal GDP</w:t>
             </w:r>
           </w:p>
@@ -19716,7 +21230,7 @@
         <w:t xml:space="preserve">•</w:t>
       </w:r>
       <w:r>
-        <w:t xml:space="preserve">  scripts/models/canonical.py — canonical observation, status and fiscal-period model</w:t>
+        <w:t xml:space="preserve">  scripts/config/evidence_specs.py — frozen evidence questions, inputs, models and decision thresholds</w:t>
       </w:r>
     </w:p>
     <w:p>
@@ -19733,7 +21247,7 @@
         <w:t xml:space="preserve">•</w:t>
       </w:r>
       <w:r>
-        <w:t xml:space="preserve">  scripts/build_focused_pipeline.py — seven-bundle orchestrator</w:t>
+        <w:t xml:space="preserve">  scripts/audit_evidence_readiness.py — read-only registered sample and eligibility audit</w:t>
       </w:r>
     </w:p>
     <w:p>
@@ -19750,7 +21264,7 @@
         <w:t xml:space="preserve">•</w:t>
       </w:r>
       <w:r>
-        <w:t xml:space="preserve">  scripts/build_&lt;lens&gt;.py — source-to-bundle builders</w:t>
+        <w:t xml:space="preserve">  scripts/models/canonical.py — canonical observation, status and fiscal-period model</w:t>
       </w:r>
     </w:p>
     <w:p>
@@ -19767,7 +21281,7 @@
         <w:t xml:space="preserve">•</w:t>
       </w:r>
       <w:r>
-        <w:t xml:space="preserve">  scripts/extractors/ — provider-specific acquisition and raw archiving</w:t>
+        <w:t xml:space="preserve">  scripts/models/evidence.py — evidence-result, estimate, diagnostic and eligibility models</w:t>
       </w:r>
     </w:p>
     <w:p>
@@ -19784,7 +21298,7 @@
         <w:t xml:space="preserve">•</w:t>
       </w:r>
       <w:r>
-        <w:t xml:space="preserve">  scripts/transforms/ — reusable formulas and time-series transformations</w:t>
+        <w:t xml:space="preserve">  scripts/analysis/ — registered loading, alignment and pre-estimation eligibility</w:t>
       </w:r>
     </w:p>
     <w:p>
@@ -19801,7 +21315,7 @@
         <w:t xml:space="preserve">•</w:t>
       </w:r>
       <w:r>
-        <w:t xml:space="preserve">  scripts/validators/quality.py — record and output quality gates</w:t>
+        <w:t xml:space="preserve">  scripts/analysis/regression.py — explicit statsmodels OLS/HAC boundary and diagnostics</w:t>
       </w:r>
     </w:p>
     <w:p>
@@ -19818,7 +21332,7 @@
         <w:t xml:space="preserve">•</w:t>
       </w:r>
       <w:r>
-        <w:t xml:space="preserve">  scripts/exporters/json_export.py — strict atomic JSON writer</w:t>
+        <w:t xml:space="preserve">  scripts/analysis/estimation.py — registered designs, robustness, adjustment and grading</w:t>
       </w:r>
     </w:p>
     <w:p>
@@ -19835,7 +21349,7 @@
         <w:t xml:space="preserve">•</w:t>
       </w:r>
       <w:r>
-        <w:t xml:space="preserve">  scripts/promote_processed_data.py — validated frontend promotion</w:t>
+        <w:t xml:space="preserve">  scripts/build_evidence_reports.py — validated evidence build and promotion orchestrator</w:t>
       </w:r>
     </w:p>
     <w:p>
@@ -19852,7 +21366,7 @@
         <w:t xml:space="preserve">•</w:t>
       </w:r>
       <w:r>
-        <w:t xml:space="preserve">  scripts/sync_focused_catalogue.py — catalogue availability and presentation generation</w:t>
+        <w:t xml:space="preserve">  scripts/review_evidence_reports.py — independent-code-path numerical reproduction</w:t>
       </w:r>
     </w:p>
     <w:p>
@@ -19869,7 +21383,7 @@
         <w:t xml:space="preserve">•</w:t>
       </w:r>
       <w:r>
-        <w:t xml:space="preserve">  schemas/dated_multi_series.schema.json — focused published contract</w:t>
+        <w:t xml:space="preserve">  scripts/build_focused_pipeline.py — seven-bundle orchestrator</w:t>
       </w:r>
     </w:p>
     <w:p>
@@ -19886,7 +21400,7 @@
         <w:t xml:space="preserve">•</w:t>
       </w:r>
       <w:r>
-        <w:t xml:space="preserve">  frontend/public/data/catalogue.json — runtime navigation/asset control plane</w:t>
+        <w:t xml:space="preserve">  scripts/build_&lt;lens&gt;.py — source-to-bundle builders</w:t>
       </w:r>
     </w:p>
     <w:p>
@@ -19903,7 +21417,7 @@
         <w:t xml:space="preserve">•</w:t>
       </w:r>
       <w:r>
-        <w:t xml:space="preserve">  frontend/src/pages/ResearchLensPage.tsx — scrollable one-page-per-lens layout</w:t>
+        <w:t xml:space="preserve">  scripts/extractors/ — provider-specific acquisition and raw archiving</w:t>
       </w:r>
     </w:p>
     <w:p>
@@ -19920,7 +21434,279 @@
         <w:t xml:space="preserve">•</w:t>
       </w:r>
       <w:r>
+        <w:t xml:space="preserve">  scripts/transforms/ — reusable formulas and time-series transformations</w:t>
+      </w:r>
+    </w:p>
+    <w:p>
+      <w:pPr>
+        <w:pStyle w:val="ListParagraph"/>
+        <w:keepLines/>
+        <w:ind w:left="360"/>
+      </w:pPr>
+      <w:r>
+        <w:rPr>
+          <w:b/>
+          <w:color w:val="D97706"/>
+        </w:rPr>
+        <w:t xml:space="preserve">•</w:t>
+      </w:r>
+      <w:r>
+        <w:t xml:space="preserve">  scripts/validators/quality.py — record and output quality gates</w:t>
+      </w:r>
+    </w:p>
+    <w:p>
+      <w:pPr>
+        <w:pStyle w:val="ListParagraph"/>
+        <w:keepLines/>
+        <w:ind w:left="360"/>
+      </w:pPr>
+      <w:r>
+        <w:rPr>
+          <w:b/>
+          <w:color w:val="D97706"/>
+        </w:rPr>
+        <w:t xml:space="preserve">•</w:t>
+      </w:r>
+      <w:r>
+        <w:t xml:space="preserve">  scripts/exporters/json_export.py — strict atomic JSON writer</w:t>
+      </w:r>
+    </w:p>
+    <w:p>
+      <w:pPr>
+        <w:pStyle w:val="ListParagraph"/>
+        <w:keepLines/>
+        <w:ind w:left="360"/>
+      </w:pPr>
+      <w:r>
+        <w:rPr>
+          <w:b/>
+          <w:color w:val="D97706"/>
+        </w:rPr>
+        <w:t xml:space="preserve">•</w:t>
+      </w:r>
+      <w:r>
+        <w:t xml:space="preserve">  scripts/promote_processed_data.py — validated frontend promotion</w:t>
+      </w:r>
+    </w:p>
+    <w:p>
+      <w:pPr>
+        <w:pStyle w:val="ListParagraph"/>
+        <w:keepLines/>
+        <w:ind w:left="360"/>
+      </w:pPr>
+      <w:r>
+        <w:rPr>
+          <w:b/>
+          <w:color w:val="D97706"/>
+        </w:rPr>
+        <w:t xml:space="preserve">•</w:t>
+      </w:r>
+      <w:r>
+        <w:t xml:space="preserve">  scripts/builders/evidence_report.py — registered lens-level evidence report assembly</w:t>
+      </w:r>
+    </w:p>
+    <w:p>
+      <w:pPr>
+        <w:pStyle w:val="ListParagraph"/>
+        <w:keepLines/>
+        <w:ind w:left="360"/>
+      </w:pPr>
+      <w:r>
+        <w:rPr>
+          <w:b/>
+          <w:color w:val="D97706"/>
+        </w:rPr>
+        <w:t xml:space="preserve">•</w:t>
+      </w:r>
+      <w:r>
+        <w:t xml:space="preserve">  scripts/validators/evidence.py — schema and cross-field evidence validation</w:t>
+      </w:r>
+    </w:p>
+    <w:p>
+      <w:pPr>
+        <w:pStyle w:val="ListParagraph"/>
+        <w:keepLines/>
+        <w:ind w:left="360"/>
+      </w:pPr>
+      <w:r>
+        <w:rPr>
+          <w:b/>
+          <w:color w:val="D97706"/>
+        </w:rPr>
+        <w:t xml:space="preserve">•</w:t>
+      </w:r>
+      <w:r>
+        <w:t xml:space="preserve">  scripts/sync_focused_catalogue.py — catalogue availability and presentation generation</w:t>
+      </w:r>
+    </w:p>
+    <w:p>
+      <w:pPr>
+        <w:pStyle w:val="ListParagraph"/>
+        <w:keepLines/>
+        <w:ind w:left="360"/>
+      </w:pPr>
+      <w:r>
+        <w:rPr>
+          <w:b/>
+          <w:color w:val="D97706"/>
+        </w:rPr>
+        <w:t xml:space="preserve">•</w:t>
+      </w:r>
+      <w:r>
+        <w:t xml:space="preserve">  scripts/sync_public_schemas.py — authoritative schema synchronisation to the frontend</w:t>
+      </w:r>
+    </w:p>
+    <w:p>
+      <w:pPr>
+        <w:pStyle w:val="ListParagraph"/>
+        <w:keepLines/>
+        <w:ind w:left="360"/>
+      </w:pPr>
+      <w:r>
+        <w:rPr>
+          <w:b/>
+          <w:color w:val="D97706"/>
+        </w:rPr>
+        <w:t xml:space="preserve">•</w:t>
+      </w:r>
+      <w:r>
+        <w:t xml:space="preserve">  schemas/dated_multi_series.schema.json — focused published contract</w:t>
+      </w:r>
+    </w:p>
+    <w:p>
+      <w:pPr>
+        <w:pStyle w:val="ListParagraph"/>
+        <w:keepLines/>
+        <w:ind w:left="360"/>
+      </w:pPr>
+      <w:r>
+        <w:rPr>
+          <w:b/>
+          <w:color w:val="D97706"/>
+        </w:rPr>
+        <w:t xml:space="preserve">•</w:t>
+      </w:r>
+      <w:r>
+        <w:t xml:space="preserve">  schemas/evidence_report.schema.json — versioned analytical-evidence contract</w:t>
+      </w:r>
+    </w:p>
+    <w:p>
+      <w:pPr>
+        <w:pStyle w:val="ListParagraph"/>
+        <w:keepLines/>
+        <w:ind w:left="360"/>
+      </w:pPr>
+      <w:r>
+        <w:rPr>
+          <w:b/>
+          <w:color w:val="D97706"/>
+        </w:rPr>
+        <w:t xml:space="preserve">•</w:t>
+      </w:r>
+      <w:r>
+        <w:t xml:space="preserve">  docs/decisions/0001-evidence-policy.md — initial evidence-policy decision freeze</w:t>
+      </w:r>
+    </w:p>
+    <w:p>
+      <w:pPr>
+        <w:pStyle w:val="ListParagraph"/>
+        <w:keepLines/>
+        <w:ind w:left="360"/>
+      </w:pPr>
+      <w:r>
+        <w:rPr>
+          <w:b/>
+          <w:color w:val="D97706"/>
+        </w:rPr>
+        <w:t xml:space="preserve">•</w:t>
+      </w:r>
+      <w:r>
+        <w:t xml:space="preserve">  docs/reviews/EVIDENCE_REVIEW_2026-07-28.md — internal reproducibility and interpretation review</w:t>
+      </w:r>
+    </w:p>
+    <w:p>
+      <w:pPr>
+        <w:pStyle w:val="ListParagraph"/>
+        <w:keepLines/>
+        <w:ind w:left="360"/>
+      </w:pPr>
+      <w:r>
+        <w:rPr>
+          <w:b/>
+          <w:color w:val="D97706"/>
+        </w:rPr>
+        <w:t xml:space="preserve">•</w:t>
+      </w:r>
+      <w:r>
+        <w:t xml:space="preserve">  frontend/public/data/catalogue.json — runtime navigation/asset control plane</w:t>
+      </w:r>
+    </w:p>
+    <w:p>
+      <w:pPr>
+        <w:pStyle w:val="ListParagraph"/>
+        <w:keepLines/>
+        <w:ind w:left="360"/>
+      </w:pPr>
+      <w:r>
+        <w:rPr>
+          <w:b/>
+          <w:color w:val="D97706"/>
+        </w:rPr>
+        <w:t xml:space="preserve">•</w:t>
+      </w:r>
+      <w:r>
+        <w:t xml:space="preserve">  frontend/src/pages/ResearchLensPage.tsx — scrollable one-page-per-lens layout</w:t>
+      </w:r>
+    </w:p>
+    <w:p>
+      <w:pPr>
+        <w:pStyle w:val="ListParagraph"/>
+        <w:keepLines/>
+        <w:ind w:left="360"/>
+      </w:pPr>
+      <w:r>
+        <w:rPr>
+          <w:b/>
+          <w:color w:val="D97706"/>
+        </w:rPr>
+        <w:t xml:space="preserve">•</w:t>
+      </w:r>
+      <w:r>
         <w:t xml:space="preserve">  frontend/src/components/MetricPanel.tsx — chart/insight/source composition</w:t>
+      </w:r>
+    </w:p>
+    <w:p>
+      <w:pPr>
+        <w:pStyle w:val="ListParagraph"/>
+        <w:keepLines/>
+        <w:ind w:left="360"/>
+      </w:pPr>
+      <w:r>
+        <w:rPr>
+          <w:b/>
+          <w:color w:val="D97706"/>
+        </w:rPr>
+        <w:t xml:space="preserve">•</w:t>
+      </w:r>
+      <w:r>
+        <w:t xml:space="preserve">  frontend/src/components/EvidencePanel.tsx — lens-level status, uncertainty, diagnostics and robustness display</w:t>
+      </w:r>
+    </w:p>
+    <w:p>
+      <w:pPr>
+        <w:pStyle w:val="ListParagraph"/>
+        <w:keepLines/>
+        <w:ind w:left="360"/>
+      </w:pPr>
+      <w:r>
+        <w:rPr>
+          <w:b/>
+          <w:color w:val="D97706"/>
+        </w:rPr>
+        <w:t xml:space="preserve">•</w:t>
+      </w:r>
+      <w:r>
+        <w:t xml:space="preserve">  frontend/src/hooks/useEvidenceData.ts — separately guarded evidence loading</w:t>
       </w:r>
     </w:p>
     <w:p>

</xml_diff>